<commit_message>
update to data ingenierie
</commit_message>
<xml_diff>
--- a/docs/files/CV_Vanessa_KENNICHE_SANOCKA_fr.docx
+++ b/docs/files/CV_Vanessa_KENNICHE_SANOCKA_fr.docx
@@ -119,152 +119,26 @@
       <w:r>
         <w:rPr>
           <w:rFonts w:cstheme="minorHAnsi"/>
-        </w:rPr>
-        <w:t>S</w:t>
-      </w:r>
-      <w:r>
-        <w:rPr>
-          <w:rFonts w:cstheme="minorHAnsi"/>
-        </w:rPr>
-        <w:t>pécialisée</w:t>
-      </w:r>
-      <w:r>
-        <w:rPr>
-          <w:rFonts w:cstheme="minorHAnsi"/>
-        </w:rPr>
-        <w:t xml:space="preserve"> en</w:t>
-      </w:r>
-      <w:r>
-        <w:rPr>
-          <w:rFonts w:cstheme="minorHAnsi"/>
+          <w:sz w:val="21"/>
+          <w:szCs w:val="21"/>
+        </w:rPr>
+        <w:t>Ingénierie appliquée aux politiques publiques. Conception et maintenance de pipelines data de bout en bout, indexation RAG avec déploiement conteneurisé,</w:t>
+      </w:r>
+      <w:r>
+        <w:rPr>
+          <w:rFonts w:cstheme="minorHAnsi"/>
+          <w:sz w:val="21"/>
+          <w:szCs w:val="21"/>
         </w:rPr>
         <w:t xml:space="preserve"> </w:t>
       </w:r>
       <w:r>
         <w:rPr>
           <w:rFonts w:cstheme="minorHAnsi"/>
-        </w:rPr>
-        <w:t>économie quantitative et analyse de politiques publiques.</w:t>
-      </w:r>
-      <w:r>
-        <w:rPr>
-          <w:rFonts w:cstheme="minorHAnsi"/>
-        </w:rPr>
-        <w:t xml:space="preserve"> </w:t>
-      </w:r>
-      <w:r>
-        <w:rPr>
-          <w:rFonts w:cstheme="minorHAnsi"/>
-        </w:rPr>
-        <w:t>Conduite</w:t>
-      </w:r>
-      <w:r>
-        <w:rPr>
-          <w:rFonts w:cstheme="minorHAnsi"/>
-        </w:rPr>
-        <w:t xml:space="preserve"> de projets</w:t>
-      </w:r>
-      <w:r>
-        <w:rPr>
-          <w:rFonts w:cstheme="minorHAnsi"/>
-        </w:rPr>
-        <w:t> :</w:t>
-      </w:r>
-      <w:r>
-        <w:rPr>
-          <w:rFonts w:cstheme="minorHAnsi"/>
-        </w:rPr>
-        <w:t xml:space="preserve"> modélisation </w:t>
-      </w:r>
-      <w:r>
-        <w:rPr>
-          <w:rFonts w:cstheme="minorHAnsi"/>
-        </w:rPr>
-        <w:t>économétrique, traitement</w:t>
-      </w:r>
-      <w:r>
-        <w:rPr>
-          <w:rFonts w:cstheme="minorHAnsi"/>
-        </w:rPr>
-        <w:t xml:space="preserve"> de données </w:t>
-      </w:r>
-      <w:r>
-        <w:rPr>
-          <w:rFonts w:cstheme="minorHAnsi"/>
-        </w:rPr>
-        <w:t>volumineuses et sensibles, restitution</w:t>
-      </w:r>
-      <w:r>
-        <w:rPr>
-          <w:rFonts w:cstheme="minorHAnsi"/>
-        </w:rPr>
-        <w:t xml:space="preserve"> d'analyses </w:t>
-      </w:r>
-      <w:r>
-        <w:rPr>
-          <w:rFonts w:cstheme="minorHAnsi"/>
-        </w:rPr>
-        <w:t>complexes</w:t>
-      </w:r>
-      <w:r>
-        <w:rPr>
-          <w:rFonts w:cstheme="minorHAnsi"/>
-        </w:rPr>
-        <w:t xml:space="preserve"> en recommandations </w:t>
-      </w:r>
-      <w:r>
-        <w:rPr>
-          <w:rFonts w:cstheme="minorHAnsi"/>
-          <w:bCs/>
-        </w:rPr>
-        <w:t>accessibles</w:t>
-      </w:r>
-      <w:r>
-        <w:rPr>
-          <w:rFonts w:cstheme="minorHAnsi"/>
-          <w:b/>
-          <w:bCs/>
-        </w:rPr>
-        <w:t xml:space="preserve"> </w:t>
-      </w:r>
-      <w:r>
-        <w:rPr>
-          <w:rFonts w:cstheme="minorHAnsi"/>
-          <w:bCs/>
-        </w:rPr>
-        <w:t>aux</w:t>
-      </w:r>
-      <w:r>
-        <w:rPr>
-          <w:rFonts w:cstheme="minorHAnsi"/>
-          <w:b/>
-          <w:bCs/>
-        </w:rPr>
-        <w:t xml:space="preserve"> </w:t>
-      </w:r>
-      <w:r>
-        <w:rPr>
-          <w:rFonts w:cstheme="minorHAnsi"/>
-        </w:rPr>
-        <w:t>multi-parties prenantes.</w:t>
-      </w:r>
-      <w:r>
-        <w:rPr>
-          <w:rFonts w:cstheme="minorHAnsi"/>
-        </w:rPr>
-        <w:t xml:space="preserve"> </w:t>
-      </w:r>
-      <w:r>
-        <w:rPr>
-          <w:rFonts w:cstheme="minorHAnsi"/>
-        </w:rPr>
-        <w:t xml:space="preserve">Programmation et </w:t>
-      </w:r>
-      <w:r>
-        <w:rPr>
-          <w:rFonts w:cstheme="minorHAnsi"/>
-        </w:rPr>
-        <w:t>solutions de visualisation innovantes.</w:t>
+          <w:sz w:val="21"/>
+          <w:szCs w:val="21"/>
+        </w:rPr>
+        <w:t>industrialisation de modèles ML dans le respect des exigences de traçabilité, de sécurité et de conformité propres aux institutions publiques, et restitution d'analyses complexes en outils accessibles aux équipes métier. Modélisation économétrique et solutions de visualisation intégrées au système d'information.</w:t>
       </w:r>
     </w:p>
     <w:p>
@@ -385,126 +259,54 @@
         <w:jc w:val="both"/>
         <w:rPr>
           <w:rFonts w:cstheme="minorHAnsi"/>
-        </w:rPr>
-      </w:pPr>
-      <w:r>
-        <w:rPr>
-          <w:rFonts w:cstheme="minorHAnsi"/>
-          <w:b/>
-        </w:rPr>
-        <w:t>Modélisation</w:t>
-      </w:r>
-      <w:r>
-        <w:rPr>
-          <w:rFonts w:cstheme="minorHAnsi"/>
-          <w:b/>
-        </w:rPr>
-        <w:t xml:space="preserve"> : </w:t>
-      </w:r>
-      <w:r>
-        <w:rPr>
-          <w:rFonts w:cstheme="minorHAnsi"/>
-        </w:rPr>
-        <w:t>séries temporelles</w:t>
-      </w:r>
-      <w:r>
-        <w:rPr>
-          <w:rFonts w:cstheme="minorHAnsi"/>
+          <w:sz w:val="21"/>
+          <w:szCs w:val="21"/>
+        </w:rPr>
+      </w:pPr>
+      <w:r>
+        <w:rPr>
+          <w:rFonts w:cstheme="minorHAnsi"/>
+          <w:b/>
+          <w:sz w:val="21"/>
+          <w:szCs w:val="21"/>
+        </w:rPr>
+        <w:t>Langages</w:t>
+      </w:r>
+      <w:r>
+        <w:rPr>
+          <w:rFonts w:cstheme="minorHAnsi"/>
+          <w:b/>
+          <w:sz w:val="21"/>
+          <w:szCs w:val="21"/>
+        </w:rPr>
+        <w:t xml:space="preserve"> &amp; Frameworks</w:t>
+      </w:r>
+      <w:r>
+        <w:rPr>
+          <w:rFonts w:cstheme="minorHAnsi"/>
+          <w:b/>
+          <w:sz w:val="21"/>
+          <w:szCs w:val="21"/>
         </w:rPr>
         <w:t xml:space="preserve"> </w:t>
       </w:r>
       <w:r>
         <w:rPr>
           <w:rFonts w:cstheme="minorHAnsi"/>
-        </w:rPr>
-        <w:t>panel</w:t>
-      </w:r>
-      <w:r>
-        <w:rPr>
-          <w:rFonts w:cstheme="minorHAnsi"/>
-        </w:rPr>
-        <w:t xml:space="preserve"> data</w:t>
-      </w:r>
-      <w:r>
-        <w:rPr>
-          <w:rFonts w:cstheme="minorHAnsi"/>
-        </w:rPr>
-        <w:t xml:space="preserve">, </w:t>
-      </w:r>
-      <w:proofErr w:type="spellStart"/>
-      <w:r>
-        <w:rPr>
-          <w:rFonts w:cstheme="minorHAnsi"/>
-        </w:rPr>
-        <w:t>e</w:t>
-      </w:r>
-      <w:r>
-        <w:rPr>
-          <w:rFonts w:cstheme="minorHAnsi"/>
-        </w:rPr>
-        <w:t>vent</w:t>
-      </w:r>
-      <w:proofErr w:type="spellEnd"/>
-      <w:r>
-        <w:rPr>
-          <w:rFonts w:cstheme="minorHAnsi"/>
-        </w:rPr>
-        <w:t xml:space="preserve"> </w:t>
-      </w:r>
-      <w:proofErr w:type="spellStart"/>
-      <w:r>
-        <w:rPr>
-          <w:rFonts w:cstheme="minorHAnsi"/>
-        </w:rPr>
-        <w:t>study</w:t>
-      </w:r>
-      <w:proofErr w:type="spellEnd"/>
-      <w:r>
-        <w:rPr>
-          <w:rFonts w:cstheme="minorHAnsi"/>
-        </w:rPr>
-        <w:t>, inférence causale</w:t>
-      </w:r>
-      <w:r>
-        <w:rPr>
-          <w:rFonts w:cstheme="minorHAnsi"/>
-        </w:rPr>
-        <w:t xml:space="preserve">, </w:t>
-      </w:r>
-      <w:r>
-        <w:rPr>
-          <w:rFonts w:cstheme="minorHAnsi"/>
-        </w:rPr>
-        <w:t>ML</w:t>
-      </w:r>
-      <w:r>
-        <w:rPr>
-          <w:rFonts w:cstheme="minorHAnsi"/>
-        </w:rPr>
-        <w:t xml:space="preserve">, </w:t>
-      </w:r>
-      <w:proofErr w:type="spellStart"/>
-      <w:r>
-        <w:rPr>
-          <w:rFonts w:cstheme="minorHAnsi"/>
-        </w:rPr>
-        <w:t>geospatial</w:t>
-      </w:r>
-      <w:proofErr w:type="spellEnd"/>
-      <w:r>
-        <w:rPr>
-          <w:rFonts w:cstheme="minorHAnsi"/>
-        </w:rPr>
-        <w:t xml:space="preserve"> </w:t>
-      </w:r>
-      <w:proofErr w:type="spellStart"/>
-      <w:r>
-        <w:rPr>
-          <w:rFonts w:cstheme="minorHAnsi"/>
-        </w:rPr>
-        <w:t>analytics</w:t>
-      </w:r>
-      <w:proofErr w:type="spellEnd"/>
+          <w:b/>
+          <w:sz w:val="21"/>
+          <w:szCs w:val="21"/>
+        </w:rPr>
+        <w:t xml:space="preserve">: </w:t>
+      </w:r>
+      <w:r>
+        <w:rPr>
+          <w:rFonts w:cstheme="minorHAnsi"/>
+          <w:sz w:val="21"/>
+          <w:szCs w:val="21"/>
+        </w:rPr>
+        <w:t>Python, SQL, R, PostgreSQL, Elasticsearch, Airflow, Spark, Pandas, FastAPI</w:t>
+      </w:r>
     </w:p>
     <w:p>
       <w:pPr>
@@ -512,134 +314,154 @@
         <w:jc w:val="both"/>
         <w:rPr>
           <w:rFonts w:cstheme="minorHAnsi"/>
+          <w:sz w:val="21"/>
+          <w:szCs w:val="21"/>
           <w:lang w:val="en-US"/>
         </w:rPr>
       </w:pPr>
-      <w:proofErr w:type="spellStart"/>
-      <w:r>
-        <w:rPr>
-          <w:rFonts w:cstheme="minorHAnsi"/>
-          <w:b/>
+      <w:r>
+        <w:rPr>
+          <w:rFonts w:cstheme="minorHAnsi"/>
+          <w:b/>
+          <w:sz w:val="21"/>
+          <w:szCs w:val="21"/>
+        </w:rPr>
+        <w:t xml:space="preserve">MLOps </w:t>
+      </w:r>
+      <w:r>
+        <w:rPr>
+          <w:rFonts w:cstheme="minorHAnsi"/>
+          <w:b/>
+          <w:sz w:val="21"/>
+          <w:szCs w:val="21"/>
           <w:lang w:val="en-US"/>
         </w:rPr>
-        <w:t>Langages</w:t>
-      </w:r>
-      <w:proofErr w:type="spellEnd"/>
-      <w:r>
-        <w:rPr>
-          <w:rFonts w:cstheme="minorHAnsi"/>
-          <w:b/>
+        <w:t xml:space="preserve">&amp; </w:t>
+      </w:r>
+      <w:r>
+        <w:rPr>
+          <w:rFonts w:cstheme="minorHAnsi"/>
+          <w:b/>
+          <w:sz w:val="21"/>
+          <w:szCs w:val="21"/>
           <w:lang w:val="en-US"/>
         </w:rPr>
-        <w:t xml:space="preserve"> &amp; </w:t>
-      </w:r>
-      <w:proofErr w:type="gramStart"/>
-      <w:r>
-        <w:rPr>
-          <w:rFonts w:cstheme="minorHAnsi"/>
-          <w:b/>
+        <w:t>Data</w:t>
+      </w:r>
+      <w:r>
+        <w:rPr>
+          <w:rFonts w:cstheme="minorHAnsi"/>
+          <w:b/>
+          <w:sz w:val="21"/>
+          <w:szCs w:val="21"/>
           <w:lang w:val="en-US"/>
         </w:rPr>
-        <w:t>Data</w:t>
-      </w:r>
-      <w:r>
-        <w:rPr>
-          <w:rFonts w:cstheme="minorHAnsi"/>
-          <w:b/>
+        <w:t> :</w:t>
+      </w:r>
+      <w:r>
+        <w:rPr>
+          <w:rFonts w:cstheme="minorHAnsi"/>
+          <w:sz w:val="21"/>
+          <w:szCs w:val="21"/>
           <w:lang w:val="en-US"/>
         </w:rPr>
-        <w:t> :</w:t>
-      </w:r>
-      <w:proofErr w:type="gramEnd"/>
-      <w:r>
-        <w:rPr>
-          <w:rFonts w:cstheme="minorHAnsi"/>
-          <w:lang w:val="en-US"/>
-        </w:rPr>
         <w:t xml:space="preserve"> </w:t>
       </w:r>
       <w:r>
         <w:rPr>
           <w:rFonts w:cstheme="minorHAnsi"/>
-          <w:lang w:val="en-US"/>
-        </w:rPr>
-        <w:t>Python, R, SQL,</w:t>
-      </w:r>
-      <w:r>
-        <w:rPr>
-          <w:rFonts w:cstheme="minorHAnsi"/>
-          <w:lang w:val="en-US"/>
+          <w:sz w:val="21"/>
+          <w:szCs w:val="21"/>
+        </w:rPr>
+        <w:t>RAG</w:t>
+      </w:r>
+      <w:r>
+        <w:rPr>
+          <w:rFonts w:cstheme="minorHAnsi"/>
+          <w:sz w:val="21"/>
+          <w:szCs w:val="21"/>
+        </w:rPr>
+        <w:t xml:space="preserve">, MLflow, </w:t>
+      </w:r>
+      <w:r>
+        <w:rPr>
+          <w:rFonts w:cstheme="minorHAnsi"/>
+          <w:sz w:val="21"/>
+          <w:szCs w:val="21"/>
+        </w:rPr>
+        <w:br/>
+      </w:r>
+      <w:r>
+        <w:rPr>
+          <w:rFonts w:cstheme="minorHAnsi"/>
+          <w:sz w:val="21"/>
+          <w:szCs w:val="21"/>
+        </w:rPr>
+        <w:t>Scikit-learn, PyTorch, TensorFlow,</w:t>
+      </w:r>
+      <w:r>
+        <w:rPr>
+          <w:rFonts w:cstheme="minorHAnsi"/>
+          <w:sz w:val="21"/>
+          <w:szCs w:val="21"/>
         </w:rPr>
         <w:t xml:space="preserve"> </w:t>
       </w:r>
-      <w:proofErr w:type="spellStart"/>
-      <w:r>
-        <w:rPr>
-          <w:rFonts w:cstheme="minorHAnsi"/>
-          <w:lang w:val="en-US"/>
-        </w:rPr>
-        <w:t>Dplyr</w:t>
-      </w:r>
-      <w:proofErr w:type="spellEnd"/>
-      <w:r>
-        <w:rPr>
-          <w:rFonts w:cstheme="minorHAnsi"/>
-          <w:lang w:val="en-US"/>
+      <w:r>
+        <w:rPr>
+          <w:rFonts w:cstheme="minorHAnsi"/>
+          <w:sz w:val="21"/>
+          <w:szCs w:val="21"/>
+        </w:rPr>
+        <w:t>LangChain</w:t>
+      </w:r>
+      <w:r>
+        <w:rPr>
+          <w:rFonts w:cstheme="minorHAnsi"/>
+          <w:sz w:val="21"/>
+          <w:szCs w:val="21"/>
         </w:rPr>
         <w:t xml:space="preserve">, </w:t>
       </w:r>
       <w:r>
         <w:rPr>
           <w:rFonts w:cstheme="minorHAnsi"/>
-          <w:lang w:val="en-US"/>
-        </w:rPr>
-        <w:t xml:space="preserve">Pandas, </w:t>
-      </w:r>
-      <w:proofErr w:type="spellStart"/>
-      <w:r>
-        <w:rPr>
-          <w:rFonts w:cstheme="minorHAnsi"/>
-          <w:lang w:val="en-US"/>
-        </w:rPr>
-        <w:t>Plotly</w:t>
-      </w:r>
-      <w:proofErr w:type="spellEnd"/>
-      <w:r>
-        <w:rPr>
-          <w:rFonts w:cstheme="minorHAnsi"/>
-          <w:lang w:val="en-US"/>
-        </w:rPr>
-        <w:t xml:space="preserve">, Scikit-learn, </w:t>
-      </w:r>
-      <w:proofErr w:type="spellStart"/>
-      <w:r>
-        <w:rPr>
-          <w:rFonts w:cstheme="minorHAnsi"/>
-          <w:lang w:val="en-US"/>
-        </w:rPr>
-        <w:t>PyTorch</w:t>
-      </w:r>
-      <w:proofErr w:type="spellEnd"/>
-      <w:r>
-        <w:rPr>
-          <w:rFonts w:cstheme="minorHAnsi"/>
-          <w:lang w:val="en-US"/>
-        </w:rPr>
-        <w:t>, TensorFlow</w:t>
-      </w:r>
-      <w:r>
-        <w:rPr>
-          <w:rFonts w:cstheme="minorHAnsi"/>
-          <w:lang w:val="en-US"/>
-        </w:rPr>
-        <w:t xml:space="preserve">, Airflow, </w:t>
-      </w:r>
-      <w:r>
-        <w:rPr>
-          <w:rFonts w:cstheme="minorHAnsi"/>
-          <w:lang w:val="en-US"/>
-        </w:rPr>
-        <w:t>NLP</w:t>
+          <w:sz w:val="21"/>
+          <w:szCs w:val="21"/>
+        </w:rPr>
+        <w:t>panel</w:t>
+      </w:r>
+      <w:r>
+        <w:rPr>
+          <w:rFonts w:cstheme="minorHAnsi"/>
+          <w:sz w:val="21"/>
+          <w:szCs w:val="21"/>
+        </w:rPr>
+        <w:t xml:space="preserve"> &amp;</w:t>
+      </w:r>
+      <w:r>
+        <w:rPr>
+          <w:rFonts w:cstheme="minorHAnsi"/>
+          <w:sz w:val="21"/>
+          <w:szCs w:val="21"/>
+        </w:rPr>
+        <w:t xml:space="preserve"> </w:t>
+      </w:r>
+      <w:r>
+        <w:rPr>
+          <w:rFonts w:cstheme="minorHAnsi"/>
+          <w:sz w:val="21"/>
+          <w:szCs w:val="21"/>
+        </w:rPr>
+        <w:t>geospatial</w:t>
+      </w:r>
+      <w:r>
+        <w:rPr>
+          <w:rFonts w:cstheme="minorHAnsi"/>
+          <w:sz w:val="21"/>
+          <w:szCs w:val="21"/>
+        </w:rPr>
+        <w:t xml:space="preserve"> data</w:t>
       </w:r>
     </w:p>
     <w:p>
@@ -648,6 +470,8 @@
         <w:jc w:val="both"/>
         <w:rPr>
           <w:rFonts w:cstheme="minorHAnsi"/>
+          <w:sz w:val="21"/>
+          <w:szCs w:val="21"/>
           <w:lang w:val="en-US"/>
         </w:rPr>
         <w:sectPr>
@@ -658,109 +482,57 @@
           <w:docGrid w:linePitch="360"/>
         </w:sectPr>
       </w:pPr>
-      <w:proofErr w:type="spellStart"/>
-      <w:proofErr w:type="gramStart"/>
-      <w:r>
-        <w:rPr>
-          <w:rFonts w:cstheme="minorHAnsi"/>
-          <w:b/>
+      <w:r>
+        <w:rPr>
+          <w:rFonts w:cstheme="minorHAnsi"/>
+          <w:b/>
+          <w:sz w:val="21"/>
+          <w:szCs w:val="21"/>
+        </w:rPr>
+        <w:t>DevOps &amp; Outils</w:t>
+      </w:r>
+      <w:r>
+        <w:rPr>
+          <w:rFonts w:cstheme="minorHAnsi"/>
+          <w:b/>
+          <w:sz w:val="21"/>
+          <w:szCs w:val="21"/>
           <w:lang w:val="en-US"/>
         </w:rPr>
-        <w:t>Outils</w:t>
-      </w:r>
-      <w:proofErr w:type="spellEnd"/>
-      <w:r>
-        <w:rPr>
-          <w:rFonts w:cstheme="minorHAnsi"/>
-          <w:b/>
+        <w:t>:</w:t>
+      </w:r>
+      <w:r>
+        <w:rPr>
+          <w:rFonts w:cstheme="minorHAnsi"/>
+          <w:sz w:val="21"/>
+          <w:szCs w:val="21"/>
           <w:lang w:val="en-US"/>
         </w:rPr>
-        <w:t> :</w:t>
-      </w:r>
-      <w:proofErr w:type="gramEnd"/>
-      <w:r>
-        <w:rPr>
-          <w:rFonts w:cstheme="minorHAnsi"/>
-          <w:lang w:val="en-US"/>
-        </w:rPr>
         <w:t xml:space="preserve"> </w:t>
       </w:r>
       <w:r>
         <w:rPr>
           <w:rFonts w:cstheme="minorHAnsi"/>
-          <w:lang w:val="en-US"/>
-        </w:rPr>
-        <w:t>Shiny, Dash, Power BI,</w:t>
-      </w:r>
-      <w:r>
-        <w:rPr>
-          <w:rFonts w:cstheme="minorHAnsi"/>
-          <w:lang w:val="en-US"/>
-        </w:rPr>
-        <w:t xml:space="preserve"> </w:t>
-      </w:r>
-      <w:r>
-        <w:rPr>
-          <w:rFonts w:cstheme="minorHAnsi"/>
-          <w:lang w:val="en-US"/>
-        </w:rPr>
-        <w:t>Excel,</w:t>
-      </w:r>
-      <w:r>
-        <w:rPr>
-          <w:rFonts w:cstheme="minorHAnsi"/>
-          <w:lang w:val="en-US"/>
-        </w:rPr>
-        <w:t xml:space="preserve"> Quarto,</w:t>
-      </w:r>
-      <w:r>
-        <w:rPr>
-          <w:rFonts w:cstheme="minorHAnsi"/>
-          <w:lang w:val="en-US"/>
-        </w:rPr>
-        <w:t xml:space="preserve"> Git, Docker, </w:t>
-      </w:r>
-      <w:r>
-        <w:rPr>
-          <w:rFonts w:cstheme="minorHAnsi"/>
-          <w:lang w:val="en-US"/>
-        </w:rPr>
-        <w:t>Apache Spark</w:t>
-      </w:r>
-      <w:r>
-        <w:rPr>
-          <w:rFonts w:cstheme="minorHAnsi"/>
-          <w:lang w:val="en-US"/>
-        </w:rPr>
-        <w:t>,</w:t>
-      </w:r>
-      <w:r>
-        <w:rPr>
-          <w:rFonts w:cstheme="minorHAnsi"/>
-          <w:lang w:val="en-US"/>
-        </w:rPr>
-        <w:t xml:space="preserve"> </w:t>
-      </w:r>
-      <w:r>
-        <w:rPr>
-          <w:rFonts w:cstheme="minorHAnsi"/>
-          <w:lang w:val="en-US"/>
-        </w:rPr>
-        <w:t>MySQL</w:t>
-      </w:r>
-      <w:r>
-        <w:rPr>
-          <w:rFonts w:cstheme="minorHAnsi"/>
-          <w:lang w:val="en-US"/>
-        </w:rPr>
-        <w:t xml:space="preserve">, </w:t>
-      </w:r>
-      <w:r>
-        <w:rPr>
-          <w:rFonts w:cstheme="minorHAnsi"/>
-          <w:lang w:val="en-US"/>
-        </w:rPr>
-        <w:t>MongoDB, QGIS, CASD</w:t>
+          <w:sz w:val="21"/>
+          <w:szCs w:val="21"/>
+        </w:rPr>
+        <w:t xml:space="preserve">Docker, Linux, Git/GitLab CI, Apache Superset, Quarto, </w:t>
+      </w:r>
+      <w:r>
+        <w:rPr>
+          <w:rFonts w:cstheme="minorHAnsi"/>
+          <w:sz w:val="21"/>
+          <w:szCs w:val="21"/>
+        </w:rPr>
+        <w:t>Streamlit</w:t>
+      </w:r>
+      <w:r>
+        <w:rPr>
+          <w:rFonts w:cstheme="minorHAnsi"/>
+          <w:sz w:val="21"/>
+          <w:szCs w:val="21"/>
+        </w:rPr>
+        <w:t>, QGIS, CASD</w:t>
       </w:r>
     </w:p>
     <w:p>
@@ -886,139 +658,34 @@
         </w:rPr>
         <w:t>Cour des Comptes</w:t>
       </w:r>
-      <w:r>
-        <w:rPr>
-          <w:rFonts w:cstheme="minorHAnsi"/>
-          <w:b/>
-          <w:color w:val="0055A4"/>
-          <w:sz w:val="24"/>
-        </w:rPr>
-        <w:t xml:space="preserve">, </w:t>
-      </w:r>
-      <w:r>
-        <w:rPr>
-          <w:rFonts w:cstheme="minorHAnsi"/>
-          <w:b/>
-          <w:color w:val="0055A4"/>
-          <w:sz w:val="24"/>
-        </w:rPr>
-        <w:t>2023</w:t>
-      </w:r>
-      <w:r>
-        <w:rPr>
-          <w:rFonts w:cstheme="minorHAnsi"/>
-          <w:b/>
-          <w:color w:val="0055A4"/>
-          <w:sz w:val="24"/>
-        </w:rPr>
-        <w:t xml:space="preserve"> - Aujourd’hui</w:t>
-      </w:r>
     </w:p>
     <w:p>
       <w:pPr>
-        <w:jc w:val="both"/>
-        <w:rPr>
-          <w:rFonts w:cstheme="minorHAnsi"/>
-          <w:sz w:val="20"/>
-        </w:rPr>
-      </w:pPr>
-      <w:r>
         <w:rPr>
           <w:rFonts w:ascii="Tahoma" w:hAnsi="Tahoma" w:cs="Tahoma"/>
-          <w:b/>
-          <w:bCs/>
-          <w:szCs w:val="24"/>
-        </w:rPr>
-        <w:t>‣</w:t>
-      </w:r>
-      <w:r>
-        <w:rPr>
-          <w:rFonts w:ascii="Cambria Math" w:hAnsi="Cambria Math" w:cs="Cambria Math"/>
-          <w:b/>
-          <w:bCs/>
-          <w:szCs w:val="24"/>
-        </w:rPr>
-        <w:t xml:space="preserve"> </w:t>
-      </w:r>
-      <w:r>
-        <w:rPr>
-          <w:rStyle w:val="lev"/>
-        </w:rPr>
-        <w:t xml:space="preserve">Analyse géospatiale transfrontalière </w:t>
-      </w:r>
-      <w:r>
-        <w:rPr>
-          <w:rStyle w:val="lev"/>
-        </w:rPr>
-        <w:t>franco-suisse</w:t>
-      </w:r>
-      <w:r>
-        <w:rPr>
-          <w:rStyle w:val="lev"/>
-        </w:rPr>
-        <w:t xml:space="preserve"> </w:t>
-      </w:r>
-      <w:r>
-        <w:rPr>
-          <w:rStyle w:val="lev"/>
-        </w:rPr>
-        <w:t>(</w:t>
-      </w:r>
-      <w:r>
-        <w:rPr>
-          <w:rStyle w:val="lev"/>
-        </w:rPr>
-        <w:t xml:space="preserve">Cour des comptes </w:t>
-      </w:r>
-      <w:r>
-        <w:rPr>
-          <w:rStyle w:val="lev"/>
-        </w:rPr>
-        <w:t>S</w:t>
-      </w:r>
-      <w:r>
-        <w:rPr>
-          <w:rStyle w:val="lev"/>
-        </w:rPr>
-        <w:t>uisse</w:t>
-      </w:r>
-      <w:r>
-        <w:rPr>
-          <w:rStyle w:val="lev"/>
-        </w:rPr>
-        <w:t>)</w:t>
-      </w:r>
-      <w:r>
-        <w:rPr>
-          <w:rStyle w:val="lev"/>
-        </w:rPr>
-        <w:t xml:space="preserve"> :</w:t>
-      </w:r>
-      <w:r>
-        <w:t xml:space="preserve"> Harmonisation de données SIG hétérogènes France-Suisse pour </w:t>
-      </w:r>
-      <w:r>
-        <w:t>identifier les discontinuités réglementaires transfrontalières.</w:t>
-      </w:r>
-      <w:r>
-        <w:t xml:space="preserve"> </w:t>
-      </w:r>
-      <w:r>
-        <w:t xml:space="preserve">Transformation d'analyses géospatiales </w:t>
-      </w:r>
-      <w:r>
-        <w:t>en visualisation et</w:t>
-      </w:r>
-      <w:r>
-        <w:t xml:space="preserve"> recommandations de politique publique aux équipes institutionnelles.</w:t>
+          <w:i/>
+          <w:iCs/>
+          <w:sz w:val="21"/>
+          <w:szCs w:val="21"/>
+        </w:rPr>
+      </w:pPr>
+      <w:r>
+        <w:rPr>
+          <w:rFonts w:ascii="Tahoma" w:hAnsi="Tahoma" w:cs="Tahoma"/>
+          <w:i/>
+          <w:iCs/>
+          <w:sz w:val="21"/>
+          <w:szCs w:val="21"/>
+        </w:rPr>
+        <w:t>Data Engineer Nov 2025 – Aujourd’hui</w:t>
       </w:r>
     </w:p>
     <w:p>
       <w:pPr>
-        <w:jc w:val="both"/>
-        <w:rPr>
-          <w:rFonts w:cstheme="minorHAnsi"/>
-          <w:szCs w:val="24"/>
+        <w:rPr>
+          <w:rFonts w:cstheme="minorHAnsi"/>
+          <w:sz w:val="21"/>
+          <w:szCs w:val="21"/>
         </w:rPr>
       </w:pPr>
       <w:r>
@@ -1026,334 +693,110 @@
           <w:rFonts w:ascii="Tahoma" w:hAnsi="Tahoma" w:cs="Tahoma"/>
           <w:b/>
           <w:bCs/>
-          <w:szCs w:val="24"/>
+          <w:sz w:val="21"/>
+          <w:szCs w:val="21"/>
         </w:rPr>
         <w:t>‣</w:t>
       </w:r>
       <w:r>
         <w:rPr>
-          <w:rFonts w:cstheme="minorHAnsi"/>
-          <w:b/>
-          <w:bCs/>
-          <w:szCs w:val="24"/>
+          <w:rFonts w:ascii="Cambria Math" w:hAnsi="Cambria Math" w:cs="Cambria Math"/>
+          <w:b/>
+          <w:bCs/>
+          <w:sz w:val="21"/>
+          <w:szCs w:val="21"/>
         </w:rPr>
         <w:t xml:space="preserve"> </w:t>
       </w:r>
       <w:r>
         <w:rPr>
-          <w:rFonts w:cstheme="minorHAnsi"/>
-          <w:b/>
-          <w:bCs/>
-          <w:szCs w:val="24"/>
-        </w:rPr>
-        <w:t>É</w:t>
-      </w:r>
-      <w:r>
-        <w:rPr>
-          <w:rFonts w:cstheme="minorHAnsi"/>
-          <w:b/>
-          <w:bCs/>
-          <w:szCs w:val="24"/>
-        </w:rPr>
-        <w:t>valuation</w:t>
-      </w:r>
-      <w:r>
-        <w:rPr>
-          <w:rFonts w:cstheme="minorHAnsi"/>
-          <w:b/>
-          <w:bCs/>
-          <w:szCs w:val="24"/>
-        </w:rPr>
-        <w:t xml:space="preserve"> des</w:t>
-      </w:r>
-      <w:r>
-        <w:rPr>
-          <w:rFonts w:cstheme="minorHAnsi"/>
-          <w:b/>
-          <w:bCs/>
-          <w:szCs w:val="24"/>
-        </w:rPr>
-        <w:t xml:space="preserve"> politiques tarifaires des </w:t>
-      </w:r>
-      <w:r>
-        <w:rPr>
-          <w:rFonts w:cstheme="minorHAnsi"/>
-          <w:b/>
-          <w:bCs/>
-          <w:szCs w:val="24"/>
-        </w:rPr>
-        <w:t>transports urbains</w:t>
-      </w:r>
-      <w:r>
-        <w:rPr>
-          <w:rFonts w:cstheme="minorHAnsi"/>
-          <w:b/>
-          <w:bCs/>
-          <w:szCs w:val="24"/>
-        </w:rPr>
-        <w:t xml:space="preserve"> :</w:t>
-      </w:r>
-      <w:r>
-        <w:rPr>
-          <w:rFonts w:cstheme="minorHAnsi"/>
-          <w:b/>
-          <w:bCs/>
-          <w:szCs w:val="24"/>
+          <w:b/>
+          <w:bCs/>
+          <w:sz w:val="21"/>
+          <w:szCs w:val="21"/>
+        </w:rPr>
+        <w:t>PRISME</w:t>
+      </w:r>
+      <w:r>
+        <w:rPr>
+          <w:b/>
+          <w:bCs/>
+          <w:sz w:val="21"/>
+          <w:szCs w:val="21"/>
+        </w:rPr>
+        <w:t xml:space="preserve"> - </w:t>
+      </w:r>
+      <w:r>
+        <w:rPr>
+          <w:b/>
+          <w:bCs/>
+          <w:sz w:val="21"/>
+          <w:szCs w:val="21"/>
+        </w:rPr>
+        <w:t>Pipeline RAG</w:t>
+      </w:r>
+      <w:r>
+        <w:rPr>
+          <w:b/>
+          <w:bCs/>
+          <w:sz w:val="21"/>
+          <w:szCs w:val="21"/>
         </w:rPr>
         <w:t xml:space="preserve"> </w:t>
       </w:r>
       <w:r>
         <w:rPr>
-          <w:rFonts w:cstheme="minorHAnsi"/>
-          <w:szCs w:val="24"/>
-        </w:rPr>
-        <w:t>Modèles</w:t>
-      </w:r>
-      <w:r>
-        <w:rPr>
-          <w:rFonts w:cstheme="minorHAnsi"/>
-          <w:szCs w:val="24"/>
+          <w:b/>
+          <w:bCs/>
+          <w:sz w:val="21"/>
+          <w:szCs w:val="21"/>
+        </w:rPr>
+        <w:t>sur le corpus documentaire</w:t>
+      </w:r>
+      <w:r>
+        <w:rPr>
+          <w:b/>
+          <w:bCs/>
+          <w:sz w:val="21"/>
+          <w:szCs w:val="21"/>
         </w:rPr>
         <w:t xml:space="preserve"> </w:t>
       </w:r>
       <w:r>
         <w:rPr>
-          <w:rFonts w:cstheme="minorHAnsi"/>
-          <w:szCs w:val="24"/>
-        </w:rPr>
-        <w:t>de</w:t>
-      </w:r>
-      <w:r>
-        <w:rPr>
-          <w:rFonts w:cstheme="minorHAnsi"/>
-          <w:szCs w:val="24"/>
-        </w:rPr>
-        <w:t xml:space="preserve"> panel </w:t>
-      </w:r>
-      <w:r>
-        <w:rPr>
-          <w:rFonts w:cstheme="minorHAnsi"/>
-          <w:szCs w:val="24"/>
-        </w:rPr>
-        <w:t>&amp;</w:t>
-      </w:r>
-      <w:r>
-        <w:rPr>
-          <w:rFonts w:cstheme="minorHAnsi"/>
-          <w:szCs w:val="24"/>
+          <w:rStyle w:val="lev"/>
+          <w:sz w:val="21"/>
+          <w:szCs w:val="21"/>
+        </w:rPr>
+        <w:t>:</w:t>
+      </w:r>
+      <w:r>
+        <w:rPr>
+          <w:sz w:val="21"/>
+          <w:szCs w:val="21"/>
         </w:rPr>
         <w:t xml:space="preserve"> </w:t>
       </w:r>
-      <w:proofErr w:type="spellStart"/>
-      <w:r>
-        <w:rPr>
-          <w:rFonts w:cstheme="minorHAnsi"/>
-          <w:szCs w:val="24"/>
-        </w:rPr>
-        <w:t>event</w:t>
-      </w:r>
-      <w:proofErr w:type="spellEnd"/>
-      <w:r>
-        <w:rPr>
-          <w:rFonts w:cstheme="minorHAnsi"/>
-          <w:szCs w:val="24"/>
+      <w:r>
+        <w:rPr>
+          <w:sz w:val="21"/>
+          <w:szCs w:val="21"/>
+        </w:rPr>
+        <w:t>indexation Elasticsearch et recherche hybride sur ~35 000 publications de la Cour, chaîne complète de parsing, chunking hiérarchique, calcul d'embeddings denses, reranking par cross-encoder et génération via modèles de langage hébergés en interne, avec interface Next.js / FastAPI.</w:t>
+      </w:r>
+      <w:r>
+        <w:rPr>
+          <w:sz w:val="21"/>
+          <w:szCs w:val="21"/>
         </w:rPr>
         <w:t xml:space="preserve"> </w:t>
       </w:r>
-      <w:proofErr w:type="spellStart"/>
-      <w:r>
-        <w:rPr>
-          <w:rFonts w:cstheme="minorHAnsi"/>
-          <w:szCs w:val="24"/>
-        </w:rPr>
-        <w:t>study</w:t>
-      </w:r>
-      <w:proofErr w:type="spellEnd"/>
-      <w:r>
-        <w:rPr>
-          <w:rFonts w:cstheme="minorHAnsi"/>
-          <w:szCs w:val="24"/>
-        </w:rPr>
-        <w:t xml:space="preserve"> </w:t>
-      </w:r>
-      <w:r>
-        <w:rPr>
-          <w:rFonts w:cstheme="minorHAnsi"/>
-          <w:szCs w:val="24"/>
-        </w:rPr>
-        <w:t>(</w:t>
-      </w:r>
-      <w:r>
-        <w:rPr>
-          <w:rFonts w:cstheme="minorHAnsi"/>
-          <w:szCs w:val="24"/>
-        </w:rPr>
-        <w:t>données nationales</w:t>
-      </w:r>
-      <w:r>
-        <w:rPr>
-          <w:rFonts w:cstheme="minorHAnsi"/>
-          <w:szCs w:val="24"/>
-        </w:rPr>
-        <w:t xml:space="preserve"> </w:t>
-      </w:r>
-      <w:r>
-        <w:rPr>
-          <w:rFonts w:cstheme="minorHAnsi"/>
-          <w:szCs w:val="24"/>
-        </w:rPr>
-        <w:t>GART</w:t>
-      </w:r>
-      <w:r>
-        <w:rPr>
-          <w:rFonts w:cstheme="minorHAnsi"/>
-          <w:szCs w:val="24"/>
-        </w:rPr>
-        <w:t xml:space="preserve">, </w:t>
-      </w:r>
-      <w:r>
-        <w:rPr>
-          <w:rFonts w:cstheme="minorHAnsi"/>
-          <w:szCs w:val="24"/>
-        </w:rPr>
-        <w:t xml:space="preserve">CEREMA) </w:t>
-      </w:r>
-      <w:r>
-        <w:rPr>
-          <w:rFonts w:cstheme="minorHAnsi"/>
-          <w:szCs w:val="24"/>
-        </w:rPr>
-        <w:t>et</w:t>
-      </w:r>
-      <w:r>
-        <w:rPr>
-          <w:rFonts w:cstheme="minorHAnsi"/>
-          <w:szCs w:val="24"/>
-        </w:rPr>
-        <w:t xml:space="preserve"> étude par </w:t>
-      </w:r>
-      <w:r>
-        <w:rPr>
-          <w:rFonts w:cstheme="minorHAnsi"/>
-          <w:szCs w:val="24"/>
-        </w:rPr>
-        <w:t>sondage</w:t>
-      </w:r>
-      <w:r>
-        <w:rPr>
-          <w:rFonts w:cstheme="minorHAnsi"/>
-          <w:szCs w:val="24"/>
-        </w:rPr>
-        <w:t xml:space="preserve"> </w:t>
-      </w:r>
-      <w:r>
-        <w:rPr>
-          <w:rFonts w:cstheme="minorHAnsi"/>
-          <w:szCs w:val="24"/>
-        </w:rPr>
-        <w:t>(échantillonnage</w:t>
-      </w:r>
-      <w:r>
-        <w:rPr>
-          <w:rFonts w:cstheme="minorHAnsi"/>
-          <w:szCs w:val="24"/>
-        </w:rPr>
-        <w:t xml:space="preserve"> sur</w:t>
-      </w:r>
-      <w:r>
-        <w:rPr>
-          <w:rFonts w:cstheme="minorHAnsi"/>
-          <w:szCs w:val="24"/>
-        </w:rPr>
-        <w:t xml:space="preserve"> </w:t>
-      </w:r>
-      <w:r>
-        <w:rPr>
-          <w:rFonts w:cstheme="minorHAnsi"/>
-          <w:szCs w:val="24"/>
-        </w:rPr>
-        <w:t>base confidentielle</w:t>
-      </w:r>
-      <w:r>
-        <w:rPr>
-          <w:rFonts w:cstheme="minorHAnsi"/>
-          <w:szCs w:val="24"/>
-        </w:rPr>
-        <w:t xml:space="preserve"> des usagers</w:t>
-      </w:r>
-      <w:r>
-        <w:rPr>
-          <w:rFonts w:cstheme="minorHAnsi"/>
-          <w:szCs w:val="24"/>
-        </w:rPr>
-        <w:t xml:space="preserve">, redressement par score de propension, calage sur marges, </w:t>
-      </w:r>
-      <w:proofErr w:type="spellStart"/>
-      <w:r>
-        <w:rPr>
-          <w:rFonts w:cstheme="minorHAnsi"/>
-          <w:szCs w:val="24"/>
-        </w:rPr>
-        <w:t>bootstrapping</w:t>
-      </w:r>
-      <w:proofErr w:type="spellEnd"/>
-      <w:r>
-        <w:rPr>
-          <w:rFonts w:cstheme="minorHAnsi"/>
-          <w:szCs w:val="24"/>
-        </w:rPr>
-        <w:t>)</w:t>
-      </w:r>
-      <w:r>
-        <w:rPr>
-          <w:rFonts w:cstheme="minorHAnsi"/>
-          <w:szCs w:val="24"/>
-        </w:rPr>
-        <w:t xml:space="preserve">, enrichie </w:t>
-      </w:r>
-      <w:r>
-        <w:rPr>
-          <w:rFonts w:cstheme="minorHAnsi"/>
-          <w:szCs w:val="24"/>
-        </w:rPr>
-        <w:t>de la</w:t>
-      </w:r>
-      <w:r>
-        <w:rPr>
-          <w:rFonts w:cstheme="minorHAnsi"/>
-          <w:szCs w:val="24"/>
-        </w:rPr>
-        <w:t xml:space="preserve"> base FILOS</w:t>
-      </w:r>
-      <w:r>
-        <w:rPr>
-          <w:rFonts w:cstheme="minorHAnsi"/>
-          <w:szCs w:val="24"/>
-        </w:rPr>
-        <w:t xml:space="preserve">OFI </w:t>
-      </w:r>
-      <w:r>
-        <w:rPr>
-          <w:rFonts w:cstheme="minorHAnsi"/>
-          <w:szCs w:val="24"/>
-        </w:rPr>
-        <w:t xml:space="preserve">par recherche complémentaire, afin de formuler des recommandations sur les politiques tarifaires, avec restitution interactive via </w:t>
-      </w:r>
-      <w:proofErr w:type="spellStart"/>
-      <w:r>
-        <w:rPr>
-          <w:rFonts w:cstheme="minorHAnsi"/>
-          <w:szCs w:val="24"/>
-        </w:rPr>
-        <w:t>Shiny</w:t>
-      </w:r>
-      <w:proofErr w:type="spellEnd"/>
-      <w:r>
-        <w:rPr>
-          <w:rFonts w:cstheme="minorHAnsi"/>
-          <w:szCs w:val="24"/>
-        </w:rPr>
-        <w:t>.</w:t>
+      <w:r>
+        <w:rPr>
+          <w:sz w:val="21"/>
+          <w:szCs w:val="21"/>
+        </w:rPr>
+        <w:t>Évaluation par benchmark gold standard, avec déploiement Docker multi-services orchestré via registre interne.</w:t>
       </w:r>
     </w:p>
     <w:p>
@@ -1361,6 +804,8 @@
         <w:jc w:val="both"/>
         <w:rPr>
           <w:rFonts w:cstheme="minorHAnsi"/>
+          <w:sz w:val="21"/>
+          <w:szCs w:val="21"/>
         </w:rPr>
       </w:pPr>
       <w:r>
@@ -1368,7 +813,8 @@
           <w:rFonts w:ascii="Tahoma" w:hAnsi="Tahoma" w:cs="Tahoma"/>
           <w:b/>
           <w:bCs/>
-          <w:szCs w:val="24"/>
+          <w:sz w:val="21"/>
+          <w:szCs w:val="21"/>
         </w:rPr>
         <w:t>‣</w:t>
       </w:r>
@@ -1377,7 +823,8 @@
           <w:rFonts w:cstheme="minorHAnsi"/>
           <w:b/>
           <w:bCs/>
-          <w:szCs w:val="24"/>
+          <w:sz w:val="21"/>
+          <w:szCs w:val="21"/>
         </w:rPr>
         <w:t xml:space="preserve"> </w:t>
       </w:r>
@@ -1386,25 +833,38 @@
           <w:rFonts w:cstheme="minorHAnsi"/>
           <w:b/>
           <w:bCs/>
-          <w:szCs w:val="24"/>
-        </w:rPr>
-        <w:t>Pipeline</w:t>
-      </w:r>
-      <w:r>
-        <w:rPr>
-          <w:rFonts w:cstheme="minorHAnsi"/>
-          <w:b/>
-          <w:bCs/>
-          <w:szCs w:val="24"/>
-        </w:rPr>
-        <w:t xml:space="preserve"> NLP et RAG</w:t>
-      </w:r>
-      <w:r>
-        <w:rPr>
-          <w:rFonts w:cstheme="minorHAnsi"/>
-          <w:b/>
-          <w:bCs/>
-          <w:szCs w:val="24"/>
+          <w:sz w:val="21"/>
+          <w:szCs w:val="21"/>
+        </w:rPr>
+        <w:t xml:space="preserve">ANAPAYE </w:t>
+      </w:r>
+      <w:r>
+        <w:rPr>
+          <w:rFonts w:cstheme="minorHAnsi"/>
+          <w:b/>
+          <w:bCs/>
+          <w:sz w:val="21"/>
+          <w:szCs w:val="21"/>
+        </w:rPr>
+        <w:t xml:space="preserve">- </w:t>
+      </w:r>
+      <w:r>
+        <w:rPr>
+          <w:rFonts w:cstheme="minorHAnsi"/>
+          <w:b/>
+          <w:bCs/>
+          <w:sz w:val="21"/>
+          <w:szCs w:val="21"/>
+        </w:rPr>
+        <w:t>Pipeline data &amp; ML paie publique</w:t>
+      </w:r>
+      <w:r>
+        <w:rPr>
+          <w:rFonts w:cstheme="minorHAnsi"/>
+          <w:b/>
+          <w:bCs/>
+          <w:sz w:val="21"/>
+          <w:szCs w:val="21"/>
         </w:rPr>
         <w:t xml:space="preserve"> </w:t>
       </w:r>
@@ -1413,107 +873,164 @@
           <w:rFonts w:cstheme="minorHAnsi"/>
           <w:b/>
           <w:bCs/>
-          <w:szCs w:val="24"/>
-        </w:rPr>
-        <w:t xml:space="preserve">: </w:t>
-      </w:r>
-      <w:r>
-        <w:rPr>
-          <w:rFonts w:cstheme="minorHAnsi"/>
-          <w:bCs/>
-          <w:szCs w:val="24"/>
-        </w:rPr>
-        <w:t xml:space="preserve">Intégration </w:t>
-      </w:r>
-      <w:r>
-        <w:rPr>
-          <w:rFonts w:cstheme="minorHAnsi"/>
-        </w:rPr>
-        <w:t>full-stack pour l’exploration et l’interrogation sémantique des documents de la Cour des comptes</w:t>
-      </w:r>
-      <w:r>
-        <w:rPr>
-          <w:rFonts w:cstheme="minorHAnsi"/>
-        </w:rPr>
-        <w:t xml:space="preserve"> par</w:t>
-      </w:r>
-      <w:r>
-        <w:rPr>
-          <w:rFonts w:cstheme="minorHAnsi"/>
-        </w:rPr>
-        <w:t xml:space="preserve"> indexation </w:t>
-      </w:r>
-      <w:proofErr w:type="spellStart"/>
-      <w:r>
-        <w:rPr>
-          <w:rFonts w:cstheme="minorHAnsi"/>
-        </w:rPr>
-        <w:t>ElasticSearch</w:t>
-      </w:r>
-      <w:proofErr w:type="spellEnd"/>
-      <w:r>
-        <w:rPr>
-          <w:rFonts w:cstheme="minorHAnsi"/>
-        </w:rPr>
-        <w:t xml:space="preserve">, </w:t>
-      </w:r>
-      <w:proofErr w:type="spellStart"/>
-      <w:r>
-        <w:rPr>
-          <w:rFonts w:cstheme="minorHAnsi"/>
-        </w:rPr>
-        <w:t>embeddings</w:t>
-      </w:r>
-      <w:proofErr w:type="spellEnd"/>
-      <w:r>
-        <w:rPr>
-          <w:rFonts w:cstheme="minorHAnsi"/>
-        </w:rPr>
-        <w:t>, LLM</w:t>
-      </w:r>
-      <w:r>
-        <w:rPr>
-          <w:rFonts w:cstheme="minorHAnsi"/>
-        </w:rPr>
-        <w:t xml:space="preserve">, </w:t>
-      </w:r>
-      <w:r>
-        <w:rPr>
-          <w:rFonts w:cstheme="minorHAnsi"/>
-        </w:rPr>
-        <w:t xml:space="preserve">Sentence Transformers et API vers plateforme Next.js, incluant </w:t>
-      </w:r>
-      <w:r>
-        <w:rPr>
-          <w:rFonts w:cstheme="minorHAnsi"/>
-        </w:rPr>
-        <w:t>un</w:t>
-      </w:r>
-      <w:r>
-        <w:rPr>
-          <w:rFonts w:cstheme="minorHAnsi"/>
-        </w:rPr>
-        <w:t xml:space="preserve"> portage </w:t>
-      </w:r>
-      <w:r>
-        <w:rPr>
-          <w:rFonts w:cstheme="minorHAnsi"/>
-        </w:rPr>
-        <w:t xml:space="preserve">des données de la Cour </w:t>
-      </w:r>
-      <w:r>
-        <w:rPr>
-          <w:rFonts w:cstheme="minorHAnsi"/>
-        </w:rPr>
-        <w:t>vers un nouveau système d’archivage interne.</w:t>
+          <w:sz w:val="21"/>
+          <w:szCs w:val="21"/>
+        </w:rPr>
+        <w:t>territoriale</w:t>
+      </w:r>
+      <w:r>
+        <w:rPr>
+          <w:rFonts w:cstheme="minorHAnsi"/>
+          <w:b/>
+          <w:bCs/>
+          <w:sz w:val="21"/>
+          <w:szCs w:val="21"/>
+        </w:rPr>
+        <w:t xml:space="preserve"> </w:t>
+      </w:r>
+      <w:r>
+        <w:rPr>
+          <w:rFonts w:cstheme="minorHAnsi"/>
+          <w:b/>
+          <w:bCs/>
+          <w:sz w:val="21"/>
+          <w:szCs w:val="21"/>
+        </w:rPr>
+        <w:t>:</w:t>
+      </w:r>
+      <w:r>
+        <w:rPr>
+          <w:rFonts w:cstheme="minorHAnsi"/>
+          <w:b/>
+          <w:bCs/>
+          <w:sz w:val="21"/>
+          <w:szCs w:val="21"/>
+        </w:rPr>
+        <w:t xml:space="preserve"> </w:t>
+      </w:r>
+      <w:r>
+        <w:rPr>
+          <w:rFonts w:cstheme="minorHAnsi"/>
+          <w:sz w:val="21"/>
+          <w:szCs w:val="21"/>
+        </w:rPr>
+        <w:t xml:space="preserve">migration depuis ETL Talend legacy vers une architecture </w:t>
+      </w:r>
+      <w:r>
+        <w:rPr>
+          <w:rFonts w:cstheme="minorHAnsi"/>
+          <w:sz w:val="21"/>
+          <w:szCs w:val="21"/>
+        </w:rPr>
+        <w:t xml:space="preserve">conçue et maintenue en </w:t>
+      </w:r>
+      <w:r>
+        <w:rPr>
+          <w:rFonts w:cstheme="minorHAnsi"/>
+          <w:sz w:val="21"/>
+          <w:szCs w:val="21"/>
+        </w:rPr>
+        <w:t>Python avec parsing XML stream (XHL/PES v2) et PostgreSQL multi-schémas géré par Alembic, restitution analytique sous Apache Superset embarqué par SDK avec RLS dynamique à destination des équipes d'instruction, volet Machine Learning de détection d'anomalies en cours d'industrialisation sous MLflow.</w:t>
       </w:r>
     </w:p>
     <w:p>
       <w:pPr>
+        <w:rPr>
+          <w:rFonts w:ascii="Tahoma" w:hAnsi="Tahoma" w:cs="Tahoma"/>
+          <w:i/>
+          <w:iCs/>
+          <w:sz w:val="21"/>
+          <w:szCs w:val="21"/>
+        </w:rPr>
+      </w:pPr>
+      <w:r>
+        <w:rPr>
+          <w:rFonts w:ascii="Tahoma" w:hAnsi="Tahoma" w:cs="Tahoma"/>
+          <w:i/>
+          <w:iCs/>
+          <w:sz w:val="21"/>
+          <w:szCs w:val="21"/>
+        </w:rPr>
+        <w:t xml:space="preserve">Data </w:t>
+      </w:r>
+      <w:r>
+        <w:rPr>
+          <w:rFonts w:ascii="Tahoma" w:hAnsi="Tahoma" w:cs="Tahoma"/>
+          <w:i/>
+          <w:iCs/>
+          <w:sz w:val="21"/>
+          <w:szCs w:val="21"/>
+        </w:rPr>
+        <w:t>Scientist</w:t>
+      </w:r>
+      <w:r>
+        <w:rPr>
+          <w:rFonts w:ascii="Tahoma" w:hAnsi="Tahoma" w:cs="Tahoma"/>
+          <w:i/>
+          <w:iCs/>
+          <w:sz w:val="21"/>
+          <w:szCs w:val="21"/>
+        </w:rPr>
+        <w:t xml:space="preserve"> </w:t>
+      </w:r>
+      <w:r>
+        <w:rPr>
+          <w:rFonts w:ascii="Tahoma" w:hAnsi="Tahoma" w:cs="Tahoma"/>
+          <w:i/>
+          <w:iCs/>
+          <w:sz w:val="21"/>
+          <w:szCs w:val="21"/>
+        </w:rPr>
+        <w:t xml:space="preserve">Nov </w:t>
+      </w:r>
+      <w:r>
+        <w:rPr>
+          <w:rFonts w:ascii="Tahoma" w:hAnsi="Tahoma" w:cs="Tahoma"/>
+          <w:i/>
+          <w:iCs/>
+          <w:sz w:val="21"/>
+          <w:szCs w:val="21"/>
+        </w:rPr>
+        <w:t>202</w:t>
+      </w:r>
+      <w:r>
+        <w:rPr>
+          <w:rFonts w:ascii="Tahoma" w:hAnsi="Tahoma" w:cs="Tahoma"/>
+          <w:i/>
+          <w:iCs/>
+          <w:sz w:val="21"/>
+          <w:szCs w:val="21"/>
+        </w:rPr>
+        <w:t>3</w:t>
+      </w:r>
+      <w:r>
+        <w:rPr>
+          <w:rFonts w:ascii="Tahoma" w:hAnsi="Tahoma" w:cs="Tahoma"/>
+          <w:i/>
+          <w:iCs/>
+          <w:sz w:val="21"/>
+          <w:szCs w:val="21"/>
+        </w:rPr>
+        <w:t xml:space="preserve"> – </w:t>
+      </w:r>
+      <w:r>
+        <w:rPr>
+          <w:rFonts w:ascii="Tahoma" w:hAnsi="Tahoma" w:cs="Tahoma"/>
+          <w:i/>
+          <w:iCs/>
+          <w:sz w:val="21"/>
+          <w:szCs w:val="21"/>
+        </w:rPr>
+        <w:t>Nov 2025</w:t>
+      </w:r>
+    </w:p>
+    <w:p>
+      <w:pPr>
         <w:jc w:val="both"/>
         <w:rPr>
           <w:rFonts w:cstheme="minorHAnsi"/>
-          <w:szCs w:val="24"/>
+          <w:sz w:val="21"/>
+          <w:szCs w:val="21"/>
         </w:rPr>
       </w:pPr>
       <w:r>
@@ -1521,7 +1038,8 @@
           <w:rFonts w:ascii="Tahoma" w:hAnsi="Tahoma" w:cs="Tahoma"/>
           <w:b/>
           <w:bCs/>
-          <w:szCs w:val="24"/>
+          <w:sz w:val="21"/>
+          <w:szCs w:val="21"/>
         </w:rPr>
         <w:t>‣</w:t>
       </w:r>
@@ -1530,32 +1048,135 @@
           <w:rFonts w:cstheme="minorHAnsi"/>
           <w:b/>
           <w:bCs/>
-          <w:szCs w:val="24"/>
+          <w:sz w:val="21"/>
+          <w:szCs w:val="21"/>
         </w:rPr>
         <w:t xml:space="preserve"> </w:t>
       </w:r>
       <w:r>
         <w:rPr>
+          <w:rFonts w:cstheme="minorHAnsi"/>
+          <w:b/>
+          <w:bCs/>
+          <w:sz w:val="21"/>
+          <w:szCs w:val="21"/>
+        </w:rPr>
+        <w:t xml:space="preserve">Évaluation économétrique de politiques publiques : </w:t>
+      </w:r>
+      <w:r>
+        <w:rPr>
+          <w:rFonts w:cstheme="minorHAnsi"/>
+          <w:sz w:val="21"/>
+          <w:szCs w:val="21"/>
+        </w:rPr>
+        <w:t>modélisation des politiques tarifaires des transports urbains par panel et event study (données GART/CEREMA), étude par sondage avec redressement (score de propension, calage sur marges, bootstrapping) enrichie par FILOSOFI, restitution Shiny ; évaluation de la loi PACTE par statistiques descriptives et régressions</w:t>
+      </w:r>
+      <w:r>
+        <w:rPr>
+          <w:rFonts w:cstheme="minorHAnsi"/>
+          <w:sz w:val="21"/>
+          <w:szCs w:val="21"/>
+        </w:rPr>
+        <w:t xml:space="preserve"> prédictives</w:t>
+      </w:r>
+      <w:r>
+        <w:rPr>
+          <w:rFonts w:cstheme="minorHAnsi"/>
+          <w:sz w:val="21"/>
+          <w:szCs w:val="21"/>
+        </w:rPr>
+        <w:t xml:space="preserve"> sur base POT</w:t>
+      </w:r>
+      <w:r>
+        <w:rPr>
+          <w:rFonts w:cstheme="minorHAnsi"/>
+          <w:sz w:val="21"/>
+          <w:szCs w:val="21"/>
+        </w:rPr>
+        <w:t>E, FELIN et ERFS</w:t>
+      </w:r>
+      <w:r>
+        <w:rPr>
+          <w:rFonts w:cstheme="minorHAnsi"/>
+          <w:sz w:val="21"/>
+          <w:szCs w:val="21"/>
+        </w:rPr>
+        <w:t>.</w:t>
+      </w:r>
+    </w:p>
+    <w:p>
+      <w:pPr>
+        <w:jc w:val="both"/>
+        <w:rPr>
+          <w:rFonts w:cstheme="minorHAnsi"/>
+          <w:sz w:val="21"/>
+          <w:szCs w:val="21"/>
+        </w:rPr>
+      </w:pPr>
+      <w:r>
+        <w:rPr>
+          <w:rFonts w:ascii="Tahoma" w:hAnsi="Tahoma" w:cs="Tahoma"/>
+          <w:b/>
+          <w:bCs/>
+          <w:sz w:val="21"/>
+          <w:szCs w:val="21"/>
+        </w:rPr>
+        <w:t>‣</w:t>
+      </w:r>
+      <w:r>
+        <w:rPr>
+          <w:rFonts w:cstheme="minorHAnsi"/>
+          <w:b/>
+          <w:bCs/>
+          <w:sz w:val="21"/>
+          <w:szCs w:val="21"/>
+        </w:rPr>
+        <w:t xml:space="preserve"> </w:t>
+      </w:r>
+      <w:r>
+        <w:rPr>
+          <w:b/>
+          <w:bCs/>
+          <w:sz w:val="21"/>
+          <w:szCs w:val="21"/>
+        </w:rPr>
+        <w:t>Analyses d'appui aux contrôles</w:t>
+      </w:r>
+      <w:r>
+        <w:rPr>
           <w:rStyle w:val="lev"/>
-        </w:rPr>
-        <w:t>Modélisation prédictive sur registres nationaux confidentiels (CASD) :</w:t>
-      </w:r>
-      <w:r>
-        <w:t xml:space="preserve"> Algorithmes ML sur données judiciaires pour analyse de survie et </w:t>
-      </w:r>
-      <w:proofErr w:type="spellStart"/>
-      <w:r>
-        <w:t>scoring</w:t>
-      </w:r>
-      <w:proofErr w:type="spellEnd"/>
-      <w:r>
-        <w:t xml:space="preserve"> de risque. Modélisation sur données fiscales (EEC) pour </w:t>
-      </w:r>
-      <w:r>
-        <w:t>décision publique</w:t>
-      </w:r>
-      <w:r>
-        <w:t>.</w:t>
+          <w:sz w:val="21"/>
+          <w:szCs w:val="21"/>
+        </w:rPr>
+        <w:t xml:space="preserve"> :</w:t>
+      </w:r>
+      <w:r>
+        <w:rPr>
+          <w:sz w:val="21"/>
+          <w:szCs w:val="21"/>
+        </w:rPr>
+        <w:t xml:space="preserve"> </w:t>
+      </w:r>
+      <w:r>
+        <w:rPr>
+          <w:sz w:val="21"/>
+          <w:szCs w:val="21"/>
+        </w:rPr>
+        <w:t xml:space="preserve">modélisation prédictive ML sur registres judiciaires confidentiels (CASD), analyse de survie et scoring de risque pour la décision publique en matière carcérale ; harmonisation SIG France–Suisse </w:t>
+      </w:r>
+      <w:r>
+        <w:rPr>
+          <w:sz w:val="21"/>
+          <w:szCs w:val="21"/>
+        </w:rPr>
+        <w:t>avec</w:t>
+      </w:r>
+      <w:r>
+        <w:rPr>
+          <w:sz w:val="21"/>
+          <w:szCs w:val="21"/>
+        </w:rPr>
+        <w:t xml:space="preserve"> la Cour des comptes Suisse, identification des discontinuités réglementaires transfrontalières et restitution en visualisations et recommandations.</w:t>
       </w:r>
     </w:p>
     <w:p>
@@ -1726,7 +1347,8 @@
         <w:rPr>
           <w:rFonts w:cstheme="minorHAnsi"/>
           <w:color w:val="000000" w:themeColor="text1"/>
-          <w:sz w:val="20"/>
+          <w:sz w:val="21"/>
+          <w:szCs w:val="21"/>
         </w:rPr>
       </w:pPr>
       <w:r>
@@ -1735,7 +1357,8 @@
           <w:b/>
           <w:bCs/>
           <w:color w:val="000000" w:themeColor="text1"/>
-          <w:szCs w:val="24"/>
+          <w:sz w:val="21"/>
+          <w:szCs w:val="21"/>
         </w:rPr>
         <w:t xml:space="preserve">‣ </w:t>
       </w:r>
@@ -1745,309 +1368,41 @@
           <w:b/>
           <w:bCs/>
           <w:color w:val="000000" w:themeColor="text1"/>
-          <w:szCs w:val="24"/>
-        </w:rPr>
-        <w:t xml:space="preserve">Détection fraude bancaire : </w:t>
-      </w:r>
-      <w:r>
-        <w:rPr>
-          <w:rFonts w:cstheme="minorHAnsi"/>
+          <w:sz w:val="21"/>
+          <w:szCs w:val="21"/>
+        </w:rPr>
+        <w:t>Projets d'engineering, data &amp; ML</w:t>
+      </w:r>
+      <w:r>
+        <w:rPr>
+          <w:rFonts w:cstheme="minorHAnsi"/>
+          <w:b/>
+          <w:bCs/>
           <w:color w:val="000000" w:themeColor="text1"/>
-          <w:szCs w:val="24"/>
-        </w:rPr>
-        <w:t xml:space="preserve">Modélisation supervisée sur données déséquilibrées, techniques SMOTE/B-SMOTE, validation croisée pour </w:t>
-      </w:r>
-      <w:proofErr w:type="spellStart"/>
-      <w:r>
-        <w:rPr>
-          <w:rFonts w:cstheme="minorHAnsi"/>
+          <w:sz w:val="21"/>
+          <w:szCs w:val="21"/>
+        </w:rPr>
+        <w:t xml:space="preserve"> </w:t>
+      </w:r>
+      <w:r>
+        <w:rPr>
+          <w:rFonts w:cstheme="minorHAnsi"/>
+          <w:b/>
+          <w:bCs/>
           <w:color w:val="000000" w:themeColor="text1"/>
-          <w:szCs w:val="24"/>
-        </w:rPr>
-        <w:t>scoring</w:t>
-      </w:r>
-      <w:proofErr w:type="spellEnd"/>
+          <w:sz w:val="21"/>
+          <w:szCs w:val="21"/>
+        </w:rPr>
+        <w:t xml:space="preserve">: </w:t>
+      </w:r>
       <w:r>
         <w:rPr>
           <w:rFonts w:cstheme="minorHAnsi"/>
           <w:color w:val="000000" w:themeColor="text1"/>
-          <w:szCs w:val="24"/>
-        </w:rPr>
-        <w:t xml:space="preserve"> de risque financier.</w:t>
-      </w:r>
-    </w:p>
-    <w:p>
-      <w:pPr>
-        <w:spacing w:line="240" w:lineRule="auto"/>
-        <w:jc w:val="both"/>
-        <w:rPr>
-          <w:rFonts w:cstheme="minorHAnsi"/>
-          <w:color w:val="000000" w:themeColor="text1"/>
-          <w:szCs w:val="24"/>
-        </w:rPr>
-      </w:pPr>
-      <w:r>
-        <w:rPr>
-          <w:rFonts w:ascii="Tahoma" w:hAnsi="Tahoma" w:cs="Tahoma"/>
-          <w:b/>
-          <w:bCs/>
-          <w:color w:val="000000" w:themeColor="text1"/>
-          <w:szCs w:val="24"/>
-        </w:rPr>
-        <w:t xml:space="preserve">‣ </w:t>
-      </w:r>
-      <w:r>
-        <w:rPr>
-          <w:rFonts w:cstheme="minorHAnsi"/>
-          <w:b/>
-          <w:bCs/>
-          <w:color w:val="000000" w:themeColor="text1"/>
-          <w:szCs w:val="24"/>
-        </w:rPr>
-        <w:t xml:space="preserve">Détection de </w:t>
-      </w:r>
-      <w:proofErr w:type="spellStart"/>
-      <w:r>
-        <w:rPr>
-          <w:rFonts w:cstheme="minorHAnsi"/>
-          <w:b/>
-          <w:bCs/>
-          <w:color w:val="000000" w:themeColor="text1"/>
-          <w:szCs w:val="24"/>
-        </w:rPr>
-        <w:t>pricing</w:t>
-      </w:r>
-      <w:proofErr w:type="spellEnd"/>
-      <w:r>
-        <w:rPr>
-          <w:rFonts w:cstheme="minorHAnsi"/>
-          <w:b/>
-          <w:bCs/>
-          <w:color w:val="000000" w:themeColor="text1"/>
-          <w:szCs w:val="24"/>
-        </w:rPr>
-        <w:t xml:space="preserve"> algorithmique</w:t>
-      </w:r>
-      <w:r>
-        <w:rPr>
-          <w:rFonts w:cstheme="minorHAnsi"/>
-          <w:b/>
-          <w:bCs/>
-          <w:color w:val="000000" w:themeColor="text1"/>
-          <w:szCs w:val="24"/>
-        </w:rPr>
-        <w:t xml:space="preserve"> </w:t>
-      </w:r>
-      <w:r>
-        <w:rPr>
-          <w:rFonts w:cstheme="minorHAnsi"/>
-          <w:b/>
-          <w:bCs/>
-          <w:color w:val="000000" w:themeColor="text1"/>
-          <w:szCs w:val="24"/>
-        </w:rPr>
-        <w:t>de marché</w:t>
-      </w:r>
-      <w:r>
-        <w:rPr>
-          <w:rFonts w:cstheme="minorHAnsi"/>
-          <w:b/>
-          <w:bCs/>
-          <w:color w:val="000000" w:themeColor="text1"/>
-          <w:szCs w:val="24"/>
-        </w:rPr>
-        <w:t xml:space="preserve"> – avec le laboratoire </w:t>
-      </w:r>
-      <w:proofErr w:type="spellStart"/>
-      <w:r>
-        <w:rPr>
-          <w:rFonts w:cstheme="minorHAnsi"/>
-          <w:b/>
-          <w:bCs/>
-          <w:color w:val="000000" w:themeColor="text1"/>
-          <w:szCs w:val="24"/>
-        </w:rPr>
-        <w:t>EconomiX</w:t>
-      </w:r>
-      <w:proofErr w:type="spellEnd"/>
-      <w:r>
-        <w:rPr>
-          <w:rFonts w:cstheme="minorHAnsi"/>
-          <w:b/>
-          <w:bCs/>
-          <w:color w:val="000000" w:themeColor="text1"/>
-          <w:szCs w:val="24"/>
-        </w:rPr>
-        <w:t xml:space="preserve"> : </w:t>
-      </w:r>
-      <w:proofErr w:type="spellStart"/>
-      <w:r>
-        <w:rPr>
-          <w:rFonts w:cstheme="minorHAnsi"/>
-          <w:color w:val="000000" w:themeColor="text1"/>
-          <w:szCs w:val="24"/>
-        </w:rPr>
-        <w:t>Scraping</w:t>
-      </w:r>
-      <w:proofErr w:type="spellEnd"/>
-      <w:r>
-        <w:rPr>
-          <w:rFonts w:cstheme="minorHAnsi"/>
-          <w:color w:val="000000" w:themeColor="text1"/>
-          <w:szCs w:val="24"/>
-        </w:rPr>
-        <w:t xml:space="preserve"> haute fréquence</w:t>
-      </w:r>
-      <w:r>
-        <w:rPr>
-          <w:rFonts w:cstheme="minorHAnsi"/>
-          <w:color w:val="000000" w:themeColor="text1"/>
-          <w:szCs w:val="24"/>
-        </w:rPr>
-        <w:t xml:space="preserve"> vers</w:t>
-      </w:r>
-      <w:r>
-        <w:rPr>
-          <w:rFonts w:cstheme="minorHAnsi"/>
-          <w:color w:val="000000" w:themeColor="text1"/>
-          <w:szCs w:val="24"/>
-        </w:rPr>
-        <w:t xml:space="preserve"> </w:t>
-      </w:r>
-      <w:proofErr w:type="spellStart"/>
-      <w:r>
-        <w:rPr>
-          <w:rFonts w:cstheme="minorHAnsi"/>
-          <w:color w:val="000000" w:themeColor="text1"/>
-          <w:szCs w:val="24"/>
-        </w:rPr>
-        <w:t>datalake</w:t>
-      </w:r>
-      <w:proofErr w:type="spellEnd"/>
-      <w:r>
-        <w:rPr>
-          <w:rFonts w:cstheme="minorHAnsi"/>
-          <w:color w:val="000000" w:themeColor="text1"/>
-          <w:szCs w:val="24"/>
-        </w:rPr>
-        <w:t xml:space="preserve">, </w:t>
-      </w:r>
-      <w:r>
-        <w:rPr>
-          <w:rFonts w:cstheme="minorHAnsi"/>
-          <w:color w:val="000000" w:themeColor="text1"/>
-          <w:szCs w:val="24"/>
-        </w:rPr>
-        <w:t>classification</w:t>
-      </w:r>
-      <w:r>
-        <w:rPr>
-          <w:rFonts w:cstheme="minorHAnsi"/>
-          <w:color w:val="000000" w:themeColor="text1"/>
-          <w:szCs w:val="24"/>
-        </w:rPr>
-        <w:t xml:space="preserve"> </w:t>
-      </w:r>
-      <w:r>
-        <w:rPr>
-          <w:rFonts w:cstheme="minorHAnsi"/>
-          <w:color w:val="000000" w:themeColor="text1"/>
-          <w:szCs w:val="24"/>
-        </w:rPr>
-        <w:t>et estimation des ajustements</w:t>
-      </w:r>
-      <w:r>
-        <w:rPr>
-          <w:rFonts w:cstheme="minorHAnsi"/>
-          <w:color w:val="000000" w:themeColor="text1"/>
-          <w:szCs w:val="24"/>
-        </w:rPr>
-        <w:t xml:space="preserve"> de prix</w:t>
-      </w:r>
-      <w:r>
-        <w:rPr>
-          <w:rFonts w:cstheme="minorHAnsi"/>
-          <w:color w:val="000000" w:themeColor="text1"/>
-          <w:szCs w:val="24"/>
-        </w:rPr>
-        <w:t xml:space="preserve"> par modèles d’effets fixe et tests de robustesse</w:t>
-      </w:r>
-      <w:r>
-        <w:rPr>
-          <w:rFonts w:cstheme="minorHAnsi"/>
-          <w:color w:val="000000" w:themeColor="text1"/>
-          <w:szCs w:val="24"/>
-        </w:rPr>
-        <w:t>.</w:t>
-      </w:r>
-    </w:p>
-    <w:p>
-      <w:pPr>
-        <w:spacing w:line="240" w:lineRule="auto"/>
-        <w:jc w:val="both"/>
-        <w:rPr>
-          <w:rFonts w:cstheme="minorHAnsi"/>
-          <w:color w:val="000000" w:themeColor="text1"/>
-          <w:szCs w:val="24"/>
-        </w:rPr>
-      </w:pPr>
-      <w:r>
-        <w:rPr>
-          <w:rFonts w:ascii="Tahoma" w:hAnsi="Tahoma" w:cs="Tahoma"/>
-          <w:b/>
-          <w:bCs/>
-          <w:color w:val="000000" w:themeColor="text1"/>
-          <w:szCs w:val="24"/>
-        </w:rPr>
-        <w:t xml:space="preserve">‣ </w:t>
-      </w:r>
-      <w:r>
-        <w:rPr>
-          <w:rFonts w:cstheme="minorHAnsi"/>
-          <w:b/>
-          <w:bCs/>
-          <w:color w:val="000000" w:themeColor="text1"/>
-          <w:szCs w:val="24"/>
-        </w:rPr>
-        <w:t xml:space="preserve">Benchmarking des déterminants d'innovation (Asie du Sud) : </w:t>
-      </w:r>
-      <w:r>
-        <w:rPr>
-          <w:rFonts w:cstheme="minorHAnsi"/>
-          <w:bCs/>
-          <w:color w:val="000000" w:themeColor="text1"/>
-          <w:szCs w:val="24"/>
-        </w:rPr>
-        <w:t>Modélisation économétrique cross-country (</w:t>
-      </w:r>
-      <w:proofErr w:type="spellStart"/>
-      <w:r>
-        <w:rPr>
-          <w:rFonts w:cstheme="minorHAnsi"/>
-          <w:bCs/>
-          <w:color w:val="000000" w:themeColor="text1"/>
-          <w:szCs w:val="24"/>
-        </w:rPr>
-        <w:t>logit</w:t>
-      </w:r>
-      <w:proofErr w:type="spellEnd"/>
-      <w:r>
-        <w:rPr>
-          <w:rFonts w:cstheme="minorHAnsi"/>
-          <w:bCs/>
-          <w:color w:val="000000" w:themeColor="text1"/>
-          <w:szCs w:val="24"/>
-        </w:rPr>
-        <w:t>/Poisson) sur données d'enquête avec tests de robustesse par régularisation Lasso</w:t>
-      </w:r>
-      <w:r>
-        <w:rPr>
-          <w:rFonts w:cstheme="minorHAnsi"/>
-          <w:bCs/>
-          <w:color w:val="000000" w:themeColor="text1"/>
-          <w:szCs w:val="24"/>
-        </w:rPr>
-        <w:t>.</w:t>
+          <w:sz w:val="21"/>
+          <w:szCs w:val="21"/>
+        </w:rPr>
+        <w:t>détection de pricing algorithmique de marché (avec le laboratoire EconomiX) par scraping haute fréquence vers datalake et estimation des ajustements de prix ; détection de fraude bancaire par modélisation supervisée sur données déséquilibrées (SMOTE/B-SMOTE, validation croisée) ; pipeline Power BI démographique sur entrepôt en étoile MySQL avec requêtes à fenêtrage pour tableau de bord territorial.</w:t>
       </w:r>
     </w:p>
     <w:p>
@@ -2059,9 +1414,11 @@
         <w:jc w:val="both"/>
         <w:rPr>
           <w:rFonts w:cstheme="minorHAnsi"/>
+          <w:b/>
           <w:bCs/>
           <w:color w:val="000000" w:themeColor="text1"/>
-          <w:szCs w:val="24"/>
+          <w:sz w:val="21"/>
+          <w:szCs w:val="21"/>
         </w:rPr>
       </w:pPr>
       <w:r>
@@ -2070,7 +1427,8 @@
           <w:b/>
           <w:bCs/>
           <w:color w:val="000000" w:themeColor="text1"/>
-          <w:szCs w:val="24"/>
+          <w:sz w:val="21"/>
+          <w:szCs w:val="21"/>
         </w:rPr>
         <w:t xml:space="preserve">‣ </w:t>
       </w:r>
@@ -2079,366 +1437,59 @@
           <w:rFonts w:cstheme="minorHAnsi"/>
           <w:b/>
           <w:color w:val="000000" w:themeColor="text1"/>
-          <w:szCs w:val="24"/>
-        </w:rPr>
-        <w:t xml:space="preserve">Network </w:t>
-      </w:r>
-      <w:proofErr w:type="spellStart"/>
+          <w:sz w:val="21"/>
+          <w:szCs w:val="21"/>
+        </w:rPr>
+        <w:t>Projets de modélisation &amp; analyse</w:t>
+      </w:r>
       <w:r>
         <w:rPr>
           <w:rFonts w:cstheme="minorHAnsi"/>
           <w:b/>
           <w:color w:val="000000" w:themeColor="text1"/>
-          <w:szCs w:val="24"/>
-        </w:rPr>
-        <w:t>analysis</w:t>
-      </w:r>
-      <w:proofErr w:type="spellEnd"/>
+          <w:sz w:val="21"/>
+          <w:szCs w:val="21"/>
+        </w:rPr>
+        <w:t xml:space="preserve"> </w:t>
+      </w:r>
       <w:r>
         <w:rPr>
           <w:rFonts w:cstheme="minorHAnsi"/>
           <w:b/>
           <w:color w:val="000000" w:themeColor="text1"/>
-          <w:szCs w:val="24"/>
+          <w:sz w:val="21"/>
+          <w:szCs w:val="21"/>
+        </w:rPr>
+        <w:t>:</w:t>
+      </w:r>
+      <w:r>
+        <w:rPr>
+          <w:rFonts w:cstheme="minorHAnsi"/>
+          <w:bCs/>
+          <w:color w:val="000000" w:themeColor="text1"/>
+          <w:sz w:val="21"/>
+          <w:szCs w:val="21"/>
         </w:rPr>
         <w:t xml:space="preserve"> </w:t>
       </w:r>
       <w:r>
         <w:rPr>
           <w:rFonts w:cstheme="minorHAnsi"/>
-          <w:b/>
+          <w:bCs/>
           <w:color w:val="000000" w:themeColor="text1"/>
-          <w:szCs w:val="24"/>
-        </w:rPr>
-        <w:t xml:space="preserve">des votes </w:t>
-      </w:r>
-      <w:r>
-        <w:rPr>
-          <w:rFonts w:cstheme="minorHAnsi"/>
-          <w:b/>
+          <w:sz w:val="21"/>
+          <w:szCs w:val="21"/>
+        </w:rPr>
+        <w:t>benchmarking économétrique cross-country des déterminants d'innovation (logit/Poisson, régularisation Lasso) ; analyse de réseau des votes parlementaires par scraping opendata, matrices de distance et clusters pour identifier les coalitions transpartisanes ; cartographie statistique et géospatiale des risques concurrentiels sur brevets PATSTAT pour recommandations de politique industrielle</w:t>
+      </w:r>
+      <w:r>
+        <w:rPr>
+          <w:rFonts w:cstheme="minorHAnsi"/>
           <w:color w:val="000000" w:themeColor="text1"/>
-          <w:szCs w:val="24"/>
-        </w:rPr>
-        <w:t>parlementaire</w:t>
-      </w:r>
-      <w:r>
-        <w:rPr>
-          <w:rFonts w:cstheme="minorHAnsi"/>
-          <w:b/>
-          <w:color w:val="000000" w:themeColor="text1"/>
-          <w:szCs w:val="24"/>
-        </w:rPr>
-        <w:t>s</w:t>
-      </w:r>
-      <w:r>
-        <w:rPr>
-          <w:rFonts w:cstheme="minorHAnsi"/>
-          <w:b/>
-          <w:color w:val="000000" w:themeColor="text1"/>
-          <w:szCs w:val="24"/>
-        </w:rPr>
-        <w:t xml:space="preserve"> :</w:t>
-      </w:r>
-      <w:r>
-        <w:rPr>
-          <w:rFonts w:cstheme="minorHAnsi"/>
-          <w:bCs/>
-          <w:color w:val="000000" w:themeColor="text1"/>
-          <w:szCs w:val="24"/>
-        </w:rPr>
-        <w:t xml:space="preserve"> </w:t>
-      </w:r>
-      <w:proofErr w:type="spellStart"/>
-      <w:r>
-        <w:rPr>
-          <w:rFonts w:cstheme="minorHAnsi"/>
-          <w:bCs/>
-          <w:color w:val="000000" w:themeColor="text1"/>
-          <w:szCs w:val="24"/>
-        </w:rPr>
-        <w:t>Scraping</w:t>
-      </w:r>
-      <w:proofErr w:type="spellEnd"/>
-      <w:r>
-        <w:rPr>
-          <w:rFonts w:cstheme="minorHAnsi"/>
-          <w:bCs/>
-          <w:color w:val="000000" w:themeColor="text1"/>
-          <w:szCs w:val="24"/>
-        </w:rPr>
-        <w:t xml:space="preserve"> </w:t>
-      </w:r>
-      <w:proofErr w:type="spellStart"/>
-      <w:r>
-        <w:rPr>
-          <w:rFonts w:cstheme="minorHAnsi"/>
-          <w:bCs/>
-          <w:color w:val="000000" w:themeColor="text1"/>
-          <w:szCs w:val="24"/>
-        </w:rPr>
-        <w:t>opendata</w:t>
-      </w:r>
-      <w:proofErr w:type="spellEnd"/>
-      <w:r>
-        <w:rPr>
-          <w:rFonts w:cstheme="minorHAnsi"/>
-          <w:bCs/>
-          <w:color w:val="000000" w:themeColor="text1"/>
-          <w:szCs w:val="24"/>
-        </w:rPr>
-        <w:t xml:space="preserve"> </w:t>
-      </w:r>
-      <w:r>
-        <w:rPr>
-          <w:rFonts w:cstheme="minorHAnsi"/>
-          <w:bCs/>
-          <w:color w:val="000000" w:themeColor="text1"/>
-          <w:szCs w:val="24"/>
-        </w:rPr>
-        <w:t xml:space="preserve">gouvernemental, matrices de distance Manhattan et clusters </w:t>
-      </w:r>
-      <w:proofErr w:type="spellStart"/>
-      <w:r>
-        <w:rPr>
-          <w:rFonts w:cstheme="minorHAnsi"/>
-          <w:bCs/>
-          <w:color w:val="000000" w:themeColor="text1"/>
-          <w:szCs w:val="24"/>
-        </w:rPr>
-        <w:t>spring</w:t>
-      </w:r>
-      <w:proofErr w:type="spellEnd"/>
-      <w:r>
-        <w:rPr>
-          <w:rFonts w:cstheme="minorHAnsi"/>
-          <w:bCs/>
-          <w:color w:val="000000" w:themeColor="text1"/>
-          <w:szCs w:val="24"/>
-        </w:rPr>
-        <w:t xml:space="preserve"> </w:t>
-      </w:r>
-      <w:proofErr w:type="spellStart"/>
-      <w:r>
-        <w:rPr>
-          <w:rFonts w:cstheme="minorHAnsi"/>
-          <w:bCs/>
-          <w:color w:val="000000" w:themeColor="text1"/>
-          <w:szCs w:val="24"/>
-        </w:rPr>
-        <w:t>layout</w:t>
-      </w:r>
-      <w:proofErr w:type="spellEnd"/>
-      <w:r>
-        <w:rPr>
-          <w:rFonts w:cstheme="minorHAnsi"/>
-          <w:bCs/>
-          <w:color w:val="000000" w:themeColor="text1"/>
-          <w:szCs w:val="24"/>
-        </w:rPr>
-        <w:t xml:space="preserve"> pour identifier les coalitions </w:t>
-      </w:r>
-      <w:proofErr w:type="spellStart"/>
-      <w:r>
-        <w:rPr>
-          <w:rFonts w:cstheme="minorHAnsi"/>
-          <w:bCs/>
-          <w:color w:val="000000" w:themeColor="text1"/>
-          <w:szCs w:val="24"/>
-        </w:rPr>
-        <w:t>transpartisanes</w:t>
-      </w:r>
-      <w:proofErr w:type="spellEnd"/>
-      <w:r>
-        <w:rPr>
-          <w:rFonts w:cstheme="minorHAnsi"/>
-          <w:bCs/>
-          <w:color w:val="000000" w:themeColor="text1"/>
-          <w:szCs w:val="24"/>
+          <w:sz w:val="21"/>
+          <w:szCs w:val="21"/>
         </w:rPr>
         <w:t>.</w:t>
-      </w:r>
-    </w:p>
-    <w:p>
-      <w:pPr>
-        <w:spacing w:line="240" w:lineRule="auto"/>
-        <w:jc w:val="both"/>
-        <w:rPr>
-          <w:rFonts w:cstheme="minorHAnsi"/>
-          <w:color w:val="000000" w:themeColor="text1"/>
-          <w:szCs w:val="24"/>
-        </w:rPr>
-      </w:pPr>
-      <w:r>
-        <w:rPr>
-          <w:rFonts w:ascii="Tahoma" w:hAnsi="Tahoma" w:cs="Tahoma"/>
-          <w:b/>
-          <w:bCs/>
-          <w:color w:val="000000" w:themeColor="text1"/>
-          <w:szCs w:val="24"/>
-        </w:rPr>
-        <w:t xml:space="preserve">‣ </w:t>
-      </w:r>
-      <w:r>
-        <w:rPr>
-          <w:rFonts w:cstheme="minorHAnsi"/>
-          <w:b/>
-          <w:bCs/>
-          <w:color w:val="000000" w:themeColor="text1"/>
-          <w:szCs w:val="24"/>
-        </w:rPr>
-        <w:t xml:space="preserve">Pipeline Power BI démographique : </w:t>
-      </w:r>
-      <w:r>
-        <w:rPr>
-          <w:rFonts w:cstheme="minorHAnsi"/>
-          <w:color w:val="000000" w:themeColor="text1"/>
-          <w:szCs w:val="24"/>
-        </w:rPr>
-        <w:t>Entrepôt en étoile MySQL, requêtes à fenêtrage (moyennes mobiles), tableau de bord territorial pour indicateurs de politique d</w:t>
-      </w:r>
-      <w:r>
-        <w:rPr>
-          <w:rFonts w:cstheme="minorHAnsi"/>
-          <w:color w:val="000000" w:themeColor="text1"/>
-          <w:szCs w:val="24"/>
-        </w:rPr>
-        <w:t xml:space="preserve">es </w:t>
-      </w:r>
-      <w:r>
-        <w:rPr>
-          <w:rFonts w:cstheme="minorHAnsi"/>
-          <w:color w:val="000000" w:themeColor="text1"/>
-          <w:szCs w:val="24"/>
-        </w:rPr>
-        <w:t>logement</w:t>
-      </w:r>
-      <w:r>
-        <w:rPr>
-          <w:rFonts w:cstheme="minorHAnsi"/>
-          <w:color w:val="000000" w:themeColor="text1"/>
-          <w:szCs w:val="24"/>
-        </w:rPr>
-        <w:t>s privés vacants</w:t>
-      </w:r>
-      <w:r>
-        <w:rPr>
-          <w:rFonts w:cstheme="minorHAnsi"/>
-          <w:color w:val="000000" w:themeColor="text1"/>
-          <w:szCs w:val="24"/>
-        </w:rPr>
-        <w:t>.</w:t>
-      </w:r>
-    </w:p>
-    <w:p>
-      <w:pPr>
-        <w:tabs>
-          <w:tab w:val="num" w:pos="720"/>
-        </w:tabs>
-        <w:spacing w:line="240" w:lineRule="auto"/>
-        <w:jc w:val="both"/>
-        <w:rPr>
-          <w:rFonts w:cstheme="minorHAnsi"/>
-          <w:b/>
-          <w:bCs/>
-          <w:color w:val="000000" w:themeColor="text1"/>
-          <w:szCs w:val="24"/>
-        </w:rPr>
-      </w:pPr>
-      <w:r>
-        <w:rPr>
-          <w:rFonts w:ascii="Tahoma" w:hAnsi="Tahoma" w:cs="Tahoma"/>
-          <w:b/>
-          <w:bCs/>
-          <w:color w:val="000000" w:themeColor="text1"/>
-          <w:szCs w:val="24"/>
-        </w:rPr>
-        <w:t xml:space="preserve">‣ </w:t>
-      </w:r>
-      <w:r>
-        <w:rPr>
-          <w:rFonts w:cstheme="minorHAnsi"/>
-          <w:b/>
-          <w:bCs/>
-          <w:color w:val="000000" w:themeColor="text1"/>
-          <w:szCs w:val="24"/>
-        </w:rPr>
-        <w:t xml:space="preserve">Analyse </w:t>
-      </w:r>
-      <w:r>
-        <w:rPr>
-          <w:rFonts w:cstheme="minorHAnsi"/>
-          <w:b/>
-          <w:bCs/>
-          <w:color w:val="000000" w:themeColor="text1"/>
-          <w:szCs w:val="24"/>
-        </w:rPr>
-        <w:t>brevets</w:t>
-      </w:r>
-      <w:r>
-        <w:rPr>
-          <w:rFonts w:cstheme="minorHAnsi"/>
-          <w:b/>
-          <w:bCs/>
-          <w:color w:val="000000" w:themeColor="text1"/>
-          <w:szCs w:val="24"/>
-        </w:rPr>
-        <w:t xml:space="preserve"> PATSTAT : </w:t>
-      </w:r>
-      <w:r>
-        <w:rPr>
-          <w:rFonts w:cstheme="minorHAnsi"/>
-          <w:color w:val="000000" w:themeColor="text1"/>
-          <w:szCs w:val="24"/>
-        </w:rPr>
-        <w:t xml:space="preserve">Cartographie </w:t>
-      </w:r>
-      <w:r>
-        <w:rPr>
-          <w:rFonts w:cstheme="minorHAnsi"/>
-          <w:color w:val="000000" w:themeColor="text1"/>
-          <w:szCs w:val="24"/>
-        </w:rPr>
-        <w:t xml:space="preserve">des risques </w:t>
-      </w:r>
-      <w:r>
-        <w:rPr>
-          <w:rFonts w:cstheme="minorHAnsi"/>
-          <w:color w:val="000000" w:themeColor="text1"/>
-          <w:szCs w:val="24"/>
-        </w:rPr>
-        <w:t>concurrentiel</w:t>
-      </w:r>
-      <w:r>
-        <w:rPr>
-          <w:rFonts w:cstheme="minorHAnsi"/>
-          <w:color w:val="000000" w:themeColor="text1"/>
-          <w:szCs w:val="24"/>
-        </w:rPr>
-        <w:t>s</w:t>
-      </w:r>
-      <w:r>
-        <w:rPr>
-          <w:rFonts w:cstheme="minorHAnsi"/>
-          <w:color w:val="000000" w:themeColor="text1"/>
-          <w:szCs w:val="24"/>
-        </w:rPr>
-        <w:t xml:space="preserve"> et positionnement stratégique sectoriel avec visualisations</w:t>
-      </w:r>
-      <w:r>
-        <w:rPr>
-          <w:rFonts w:cstheme="minorHAnsi"/>
-          <w:color w:val="000000" w:themeColor="text1"/>
-          <w:szCs w:val="24"/>
-        </w:rPr>
-        <w:t xml:space="preserve"> statistiques et</w:t>
-      </w:r>
-      <w:r>
-        <w:rPr>
-          <w:rFonts w:cstheme="minorHAnsi"/>
-          <w:color w:val="000000" w:themeColor="text1"/>
-          <w:szCs w:val="24"/>
-        </w:rPr>
-        <w:t xml:space="preserve"> géospatiales pour recommandations de politique industrielle.</w:t>
       </w:r>
     </w:p>
     <w:p>
@@ -2544,7 +1595,8 @@
         <w:jc w:val="both"/>
         <w:rPr>
           <w:rFonts w:cstheme="minorHAnsi"/>
-          <w:sz w:val="20"/>
+          <w:sz w:val="21"/>
+          <w:szCs w:val="21"/>
         </w:rPr>
       </w:pPr>
       <w:r>
@@ -2553,7 +1605,8 @@
           <w:b/>
           <w:bCs/>
           <w:color w:val="000000" w:themeColor="text1"/>
-          <w:szCs w:val="24"/>
+          <w:sz w:val="21"/>
+          <w:szCs w:val="21"/>
         </w:rPr>
         <w:t>‣</w:t>
       </w:r>
@@ -2563,7 +1616,8 @@
           <w:b/>
           <w:bCs/>
           <w:color w:val="000000" w:themeColor="text1"/>
-          <w:szCs w:val="24"/>
+          <w:sz w:val="21"/>
+          <w:szCs w:val="21"/>
         </w:rPr>
         <w:t xml:space="preserve"> </w:t>
       </w:r>
@@ -2572,7 +1626,8 @@
           <w:rFonts w:cstheme="minorHAnsi"/>
           <w:b/>
           <w:bCs/>
-          <w:szCs w:val="24"/>
+          <w:sz w:val="21"/>
+          <w:szCs w:val="21"/>
         </w:rPr>
         <w:t>Ambassadrice pour le plan STEM "</w:t>
       </w:r>
@@ -2582,7 +1637,8 @@
           <w:rFonts w:cstheme="minorHAnsi"/>
           <w:b/>
           <w:bCs/>
-          <w:szCs w:val="24"/>
+          <w:sz w:val="21"/>
+          <w:szCs w:val="21"/>
         </w:rPr>
         <w:t>Filles et Maths</w:t>
       </w:r>
@@ -2592,34 +1648,18 @@
           <w:rFonts w:cstheme="minorHAnsi"/>
           <w:b/>
           <w:bCs/>
-          <w:szCs w:val="24"/>
-        </w:rPr>
-        <w:t xml:space="preserve">" sensibilisation </w:t>
-      </w:r>
-      <w:r>
-        <w:rPr>
-          <w:rFonts w:cstheme="minorHAnsi"/>
-          <w:b/>
-          <w:bCs/>
-          <w:szCs w:val="24"/>
-        </w:rPr>
-        <w:t xml:space="preserve">de </w:t>
-      </w:r>
-      <w:r>
-        <w:rPr>
-          <w:rFonts w:cstheme="minorHAnsi"/>
-          <w:b/>
-          <w:bCs/>
-          <w:szCs w:val="24"/>
-        </w:rPr>
-        <w:t>lycéennes aux carrières scientifiques</w:t>
-      </w:r>
-      <w:r>
-        <w:rPr>
-          <w:rFonts w:cstheme="minorHAnsi"/>
-          <w:b/>
-          <w:bCs/>
-          <w:szCs w:val="24"/>
+          <w:sz w:val="21"/>
+          <w:szCs w:val="21"/>
+        </w:rPr>
+        <w:t>" sensibilisation de lycéennes aux carrières scientifiques</w:t>
+      </w:r>
+      <w:r>
+        <w:rPr>
+          <w:rFonts w:cstheme="minorHAnsi"/>
+          <w:b/>
+          <w:bCs/>
+          <w:sz w:val="21"/>
+          <w:szCs w:val="21"/>
         </w:rPr>
         <w:t>.</w:t>
       </w:r>
@@ -2628,14 +1668,16 @@
           <w:rFonts w:cstheme="minorHAnsi"/>
           <w:b/>
           <w:bCs/>
-          <w:szCs w:val="24"/>
+          <w:sz w:val="21"/>
+          <w:szCs w:val="21"/>
         </w:rPr>
         <w:tab/>
       </w:r>
       <w:r>
         <w:rPr>
           <w:rFonts w:cstheme="minorHAnsi"/>
-          <w:sz w:val="20"/>
+          <w:sz w:val="21"/>
+          <w:szCs w:val="21"/>
         </w:rPr>
         <w:br/>
       </w:r>
@@ -2645,7 +1687,8 @@
           <w:b/>
           <w:bCs/>
           <w:color w:val="000000" w:themeColor="text1"/>
-          <w:szCs w:val="24"/>
+          <w:sz w:val="21"/>
+          <w:szCs w:val="21"/>
         </w:rPr>
         <w:t xml:space="preserve">‣ </w:t>
       </w:r>
@@ -2653,24 +1696,18 @@
         <w:rPr>
           <w:rFonts w:cstheme="minorHAnsi"/>
           <w:bCs/>
-          <w:szCs w:val="24"/>
-        </w:rPr>
-        <w:t>Conception d'outils formation et plateforme collaborative pour les Data Scientists de la Cour des comptes</w:t>
-      </w:r>
-      <w:r>
-        <w:rPr>
-          <w:rFonts w:cstheme="minorHAnsi"/>
-          <w:bCs/>
-          <w:szCs w:val="24"/>
-        </w:rPr>
-        <w:t>.</w:t>
-      </w:r>
-      <w:r>
-        <w:rPr>
-          <w:rFonts w:cstheme="minorHAnsi"/>
-          <w:b/>
-          <w:bCs/>
-          <w:szCs w:val="24"/>
+          <w:sz w:val="21"/>
+          <w:szCs w:val="21"/>
+        </w:rPr>
+        <w:t>Conception d'outils formation et plateforme collaborative pour les Data Scientists de la Cour des comptes.</w:t>
+      </w:r>
+      <w:r>
+        <w:rPr>
+          <w:rFonts w:cstheme="minorHAnsi"/>
+          <w:b/>
+          <w:bCs/>
+          <w:sz w:val="21"/>
+          <w:szCs w:val="21"/>
         </w:rPr>
         <w:t xml:space="preserve"> </w:t>
       </w:r>
@@ -2764,7 +1801,7 @@
           <wp:extent cx="844265" cy="847725"/>
           <wp:effectExtent l="0" t="0" r="0" b="0"/>
           <wp:wrapNone/>
-          <wp:docPr id="689761261" name="Image 689761261"/>
+          <wp:docPr id="1537508708" name="Image 1537508708"/>
           <wp:cNvGraphicFramePr>
             <a:graphicFrameLocks xmlns:a="http://schemas.openxmlformats.org/drawingml/2006/main" noChangeAspect="1"/>
           </wp:cNvGraphicFramePr>
@@ -2827,7 +1864,7 @@
           <wp:extent cx="1259457" cy="1259457"/>
           <wp:effectExtent l="57150" t="19050" r="55245" b="93345"/>
           <wp:wrapNone/>
-          <wp:docPr id="1797730352" name="Image 1797730352"/>
+          <wp:docPr id="1892600940" name="Image 1892600940"/>
           <wp:cNvGraphicFramePr>
             <a:graphicFrameLocks xmlns:a="http://schemas.openxmlformats.org/drawingml/2006/main" noChangeAspect="1"/>
           </wp:cNvGraphicFramePr>
@@ -3051,15 +2088,13 @@
       </w:rPr>
       <w:t xml:space="preserve">Data </w:t>
     </w:r>
-    <w:proofErr w:type="spellStart"/>
     <w:r>
       <w:rPr>
         <w:color w:val="0055A4"/>
         <w:sz w:val="36"/>
       </w:rPr>
-      <w:t>Scientist</w:t>
-    </w:r>
-    <w:proofErr w:type="spellEnd"/>
+      <w:t>&amp; Machine Learning</w:t>
+    </w:r>
   </w:p>
   <w:p>
     <w:pPr>
@@ -3968,7 +3003,7 @@
   <w:style w:type="paragraph" w:default="1" w:styleId="Normal">
     <w:name w:val="Normal"/>
     <w:qFormat/>
-    <w:rsid w:val="00B62948"/>
+    <w:rsid w:val="00C12372"/>
   </w:style>
   <w:style w:type="character" w:default="1" w:styleId="Policepardfaut">
     <w:name w:val="Default Paragraph Font"/>

</xml_diff>